<commit_message>
Fig 2: remove orphan Fp diamonds, smaller points, lighter labels
- Removed all Fp from Fig 2 (they belong in Fig 1 only)
  The 14 cross-panel Fp were appearing as unlabeled green diamonds
- Points: s=120 -> s=55
- Labels: fontsize=8 bold -> fontsize=6.5 normal weight
- adjustText: stronger repulsion params (lim=800, force 1.0/1.2)
- Grid: lighter (alpha 0.10 -> 0.08)
</commit_message>
<xml_diff>
--- a/Versions-html-and-docx/section_synthese_v4.docx
+++ b/Versions-html-and-docx/section_synthese_v4.docx
@@ -20,9 +20,192 @@
           <w:i w:val="0"/>
           <w:sz w:val="20"/>
         </w:rPr>
-        <w:t>Synthèse des découvertes principales de l'analyse formantique. 93 % de concordance multi-sources (27/29 instruments).</w:t>
+        <w:t>Synthèse des découvertes principales de l'analyse formantique complète des 27 instruments du corpus (pipeline v22). 93 % de concordance multi-sources.</w:t>
       </w:r>
     </w:p>
+    <w:p>
+      <w:pPr>
+        <w:pStyle w:val="Heading2"/>
+      </w:pPr>
+      <w:r>
+        <w:rPr>
+          <w:color w:val="2E7D32"/>
+        </w:rPr>
+        <w:t>Figure 1 — Positions formantiques des 27 instruments</w:t>
+      </w:r>
+    </w:p>
+    <w:p>
+      <w:r>
+        <w:rPr>
+          <w:b w:val="0"/>
+          <w:i/>
+          <w:sz w:val="18"/>
+        </w:rPr>
+        <w:t>F1–F4 de chaque instrument sur axe logarithmique. Marqueurs : taille décroissante de F1 à F4, losange vert = Fp centroïde. Instruments triés du plus grave au plus aigu. Bandes colorées = zones vocaliques Meyer (2009).</w:t>
+      </w:r>
+    </w:p>
+    <w:p>
+      <w:pPr>
+        <w:jc w:val="center"/>
+      </w:pPr>
+      <w:r>
+        <w:drawing>
+          <wp:inline xmlns:a="http://schemas.openxmlformats.org/drawingml/2006/main" xmlns:pic="http://schemas.openxmlformats.org/drawingml/2006/picture">
+            <wp:extent cx="5943600" cy="4628083"/>
+            <wp:docPr id="1" name="Picture 1"/>
+            <wp:cNvGraphicFramePr>
+              <a:graphicFrameLocks noChangeAspect="1"/>
+            </wp:cNvGraphicFramePr>
+            <a:graphic>
+              <a:graphicData uri="http://schemas.openxmlformats.org/drawingml/2006/picture">
+                <pic:pic>
+                  <pic:nvPicPr>
+                    <pic:cNvPr id="0" name="synthese_fig1_positions.png"/>
+                    <pic:cNvPicPr/>
+                  </pic:nvPicPr>
+                  <pic:blipFill>
+                    <a:blip r:embed="rId9"/>
+                    <a:stretch>
+                      <a:fillRect/>
+                    </a:stretch>
+                  </pic:blipFill>
+                  <pic:spPr>
+                    <a:xfrm>
+                      <a:off x="0" y="0"/>
+                      <a:ext cx="5943600" cy="4628083"/>
+                    </a:xfrm>
+                    <a:prstGeom prst="rect"/>
+                  </pic:spPr>
+                </pic:pic>
+              </a:graphicData>
+            </a:graphic>
+          </wp:inline>
+        </w:drawing>
+      </w:r>
+    </w:p>
+    <w:p/>
+    <w:p>
+      <w:pPr>
+        <w:pStyle w:val="Heading2"/>
+      </w:pPr>
+      <w:r>
+        <w:rPr>
+          <w:color w:val="2E7D32"/>
+        </w:rPr>
+        <w:t>Figure 2 — Espace vocalique F1/F2</w:t>
+      </w:r>
+    </w:p>
+    <w:p>
+      <w:r>
+        <w:rPr>
+          <w:b w:val="0"/>
+          <w:i/>
+          <w:sz w:val="18"/>
+        </w:rPr>
+        <w:t>Chaque instrument positionné dans l'espace F1 × F2, convention phonétique. Forme des marqueurs selon la famille instrumentale. Ellipse rouge = zone de convergence F1 = 377–506 Hz.</w:t>
+      </w:r>
+    </w:p>
+    <w:p>
+      <w:pPr>
+        <w:jc w:val="center"/>
+      </w:pPr>
+      <w:r>
+        <w:drawing>
+          <wp:inline xmlns:a="http://schemas.openxmlformats.org/drawingml/2006/main" xmlns:pic="http://schemas.openxmlformats.org/drawingml/2006/picture">
+            <wp:extent cx="5943600" cy="4457700"/>
+            <wp:docPr id="2" name="Picture 2"/>
+            <wp:cNvGraphicFramePr>
+              <a:graphicFrameLocks noChangeAspect="1"/>
+            </wp:cNvGraphicFramePr>
+            <a:graphic>
+              <a:graphicData uri="http://schemas.openxmlformats.org/drawingml/2006/picture">
+                <pic:pic>
+                  <pic:nvPicPr>
+                    <pic:cNvPr id="0" name="synthese_fig2_espace_vocalique.png"/>
+                    <pic:cNvPicPr/>
+                  </pic:nvPicPr>
+                  <pic:blipFill>
+                    <a:blip r:embed="rId10"/>
+                    <a:stretch>
+                      <a:fillRect/>
+                    </a:stretch>
+                  </pic:blipFill>
+                  <pic:spPr>
+                    <a:xfrm>
+                      <a:off x="0" y="0"/>
+                      <a:ext cx="5943600" cy="4457700"/>
+                    </a:xfrm>
+                    <a:prstGeom prst="rect"/>
+                  </pic:spPr>
+                </pic:pic>
+              </a:graphicData>
+            </a:graphic>
+          </wp:inline>
+        </w:drawing>
+      </w:r>
+    </w:p>
+    <w:p/>
+    <w:p>
+      <w:pPr>
+        <w:pStyle w:val="Heading2"/>
+      </w:pPr>
+      <w:r>
+        <w:rPr>
+          <w:color w:val="B71C1C"/>
+        </w:rPr>
+        <w:t>Figure 3 — Enveloppes schématiques du cluster de convergence</w:t>
+      </w:r>
+    </w:p>
+    <w:p>
+      <w:r>
+        <w:rPr>
+          <w:b w:val="0"/>
+          <w:i/>
+          <w:sz w:val="18"/>
+        </w:rPr>
+        <w:t>Enveloppes gaussiennes centrées sur le F1 strict de 11 instruments dont le F1 converge dans la zone 377–506 Hz. Bande rouge = zone de convergence. Quand les résonances coïncident, l'oreille perçoit un timbre unique.</w:t>
+      </w:r>
+    </w:p>
+    <w:p>
+      <w:pPr>
+        <w:jc w:val="center"/>
+      </w:pPr>
+      <w:r>
+        <w:drawing>
+          <wp:inline xmlns:a="http://schemas.openxmlformats.org/drawingml/2006/main" xmlns:pic="http://schemas.openxmlformats.org/drawingml/2006/picture">
+            <wp:extent cx="5943600" cy="2759529"/>
+            <wp:docPr id="3" name="Picture 3"/>
+            <wp:cNvGraphicFramePr>
+              <a:graphicFrameLocks noChangeAspect="1"/>
+            </wp:cNvGraphicFramePr>
+            <a:graphic>
+              <a:graphicData uri="http://schemas.openxmlformats.org/drawingml/2006/picture">
+                <pic:pic>
+                  <pic:nvPicPr>
+                    <pic:cNvPr id="0" name="synthese_fig3_cluster.png"/>
+                    <pic:cNvPicPr/>
+                  </pic:nvPicPr>
+                  <pic:blipFill>
+                    <a:blip r:embed="rId11"/>
+                    <a:stretch>
+                      <a:fillRect/>
+                    </a:stretch>
+                  </pic:blipFill>
+                  <pic:spPr>
+                    <a:xfrm>
+                      <a:off x="0" y="0"/>
+                      <a:ext cx="5943600" cy="2759529"/>
+                    </a:xfrm>
+                    <a:prstGeom prst="rect"/>
+                  </pic:spPr>
+                </pic:pic>
+              </a:graphicData>
+            </a:graphic>
+          </wp:inline>
+        </w:drawing>
+      </w:r>
+    </w:p>
+    <w:p/>
     <w:p>
       <w:pPr>
         <w:pStyle w:val="Heading2"/>
@@ -42,7 +225,7 @@
         <w:drawing>
           <wp:inline xmlns:a="http://schemas.openxmlformats.org/drawingml/2006/main" xmlns:pic="http://schemas.openxmlformats.org/drawingml/2006/picture">
             <wp:extent cx="5486400" cy="2404153"/>
-            <wp:docPr id="1" name="Picture 1"/>
+            <wp:docPr id="4" name="Picture 4"/>
             <wp:cNvGraphicFramePr>
               <a:graphicFrameLocks noChangeAspect="1"/>
             </wp:cNvGraphicFramePr>
@@ -54,7 +237,7 @@
                     <pic:cNvPicPr/>
                   </pic:nvPicPr>
                   <pic:blipFill>
-                    <a:blip r:embed="rId9"/>
+                    <a:blip r:embed="rId12"/>
                     <a:stretch>
                       <a:fillRect/>
                     </a:stretch>
@@ -771,7 +954,7 @@
         <w:drawing>
           <wp:inline xmlns:a="http://schemas.openxmlformats.org/drawingml/2006/main" xmlns:pic="http://schemas.openxmlformats.org/drawingml/2006/picture">
             <wp:extent cx="5943600" cy="3208902"/>
-            <wp:docPr id="2" name="Picture 2"/>
+            <wp:docPr id="5" name="Picture 5"/>
             <wp:cNvGraphicFramePr>
               <a:graphicFrameLocks noChangeAspect="1"/>
             </wp:cNvGraphicFramePr>
@@ -783,7 +966,7 @@
                     <pic:cNvPicPr/>
                   </pic:nvPicPr>
                   <pic:blipFill>
-                    <a:blip r:embed="rId10"/>
+                    <a:blip r:embed="rId13"/>
                     <a:stretch>
                       <a:fillRect/>
                     </a:stretch>
@@ -832,7 +1015,7 @@
         <w:drawing>
           <wp:inline xmlns:a="http://schemas.openxmlformats.org/drawingml/2006/main" xmlns:pic="http://schemas.openxmlformats.org/drawingml/2006/picture">
             <wp:extent cx="5943600" cy="5981739"/>
-            <wp:docPr id="3" name="Picture 3"/>
+            <wp:docPr id="6" name="Picture 6"/>
             <wp:cNvGraphicFramePr>
               <a:graphicFrameLocks noChangeAspect="1"/>
             </wp:cNvGraphicFramePr>
@@ -844,7 +1027,7 @@
                     <pic:cNvPicPr/>
                   </pic:nvPicPr>
                   <pic:blipFill>
-                    <a:blip r:embed="rId11"/>
+                    <a:blip r:embed="rId14"/>
                     <a:stretch>
                       <a:fillRect/>
                     </a:stretch>
@@ -883,7 +1066,7 @@
         <w:drawing>
           <wp:inline xmlns:a="http://schemas.openxmlformats.org/drawingml/2006/main" xmlns:pic="http://schemas.openxmlformats.org/drawingml/2006/picture">
             <wp:extent cx="5943600" cy="6239632"/>
-            <wp:docPr id="4" name="Picture 4"/>
+            <wp:docPr id="7" name="Picture 7"/>
             <wp:cNvGraphicFramePr>
               <a:graphicFrameLocks noChangeAspect="1"/>
             </wp:cNvGraphicFramePr>
@@ -895,7 +1078,7 @@
                     <pic:cNvPicPr/>
                   </pic:nvPicPr>
                   <pic:blipFill>
-                    <a:blip r:embed="rId12"/>
+                    <a:blip r:embed="rId15"/>
                     <a:stretch>
                       <a:fillRect/>
                     </a:stretch>
@@ -1120,7 +1303,7 @@
                 <w:b/>
                 <w:sz w:val="16"/>
               </w:rPr>
-              <w:t>Basson</w:t>
+              <w:t>Flûte</w:t>
             </w:r>
           </w:p>
         </w:tc>
@@ -1139,7 +1322,7 @@
                 <w:b w:val="0"/>
                 <w:sz w:val="16"/>
               </w:rPr>
-              <w:t>502</w:t>
+              <w:t>743</w:t>
             </w:r>
           </w:p>
         </w:tc>
@@ -1158,7 +1341,7 @@
                 <w:b/>
                 <w:sz w:val="16"/>
               </w:rPr>
-              <w:t>Violoncelle</w:t>
+              <w:t>Hautbois</w:t>
             </w:r>
           </w:p>
         </w:tc>
@@ -1177,7 +1360,7 @@
                 <w:b w:val="0"/>
                 <w:sz w:val="16"/>
               </w:rPr>
-              <w:t>499</w:t>
+              <w:t>743</w:t>
             </w:r>
           </w:p>
         </w:tc>
@@ -1196,7 +1379,7 @@
                 <w:b w:val="0"/>
                 <w:sz w:val="16"/>
               </w:rPr>
-              <w:t>3</w:t>
+              <w:t>0</w:t>
             </w:r>
           </w:p>
         </w:tc>
@@ -1216,6 +1399,468 @@
                 <w:sz w:val="16"/>
               </w:rPr>
               <w:t>Quasi-parfaite ★</w:t>
+            </w:r>
+          </w:p>
+        </w:tc>
+        <w:tc>
+          <w:tcPr>
+            <w:tcW w:type="dxa" w:w="510"/>
+            <w:shd w:fill="D5F5E3"/>
+          </w:tcPr>
+          <w:p>
+            <w:pPr>
+              <w:jc w:val="center"/>
+            </w:pPr>
+            <w:r/>
+            <w:r>
+              <w:rPr>
+                <w:b w:val="0"/>
+                <w:sz w:val="16"/>
+              </w:rPr>
+              <w:t>/å/</w:t>
+            </w:r>
+          </w:p>
+        </w:tc>
+        <w:tc>
+          <w:tcPr>
+            <w:tcW w:type="dxa" w:w="1020"/>
+            <w:shd w:fill="D5F5E3"/>
+          </w:tcPr>
+          <w:p>
+            <w:pPr>
+              <w:jc w:val="center"/>
+            </w:pPr>
+            <w:r/>
+            <w:r>
+              <w:rPr>
+                <w:b w:val="0"/>
+                <w:sz w:val="16"/>
+              </w:rPr>
+              <w:t>Unisson</w:t>
+            </w:r>
+          </w:p>
+        </w:tc>
+      </w:tr>
+      <w:tr>
+        <w:tc>
+          <w:tcPr>
+            <w:tcW w:type="dxa" w:w="1417"/>
+            <w:shd w:fill="D5F5E3"/>
+          </w:tcPr>
+          <w:p>
+            <w:pPr>
+              <w:jc w:val="center"/>
+            </w:pPr>
+            <w:r/>
+            <w:r>
+              <w:rPr>
+                <w:b/>
+                <w:sz w:val="16"/>
+              </w:rPr>
+              <w:t>Tuba CB</w:t>
+            </w:r>
+          </w:p>
+        </w:tc>
+        <w:tc>
+          <w:tcPr>
+            <w:tcW w:type="dxa" w:w="624"/>
+            <w:shd w:fill="D5F5E3"/>
+          </w:tcPr>
+          <w:p>
+            <w:pPr>
+              <w:jc w:val="center"/>
+            </w:pPr>
+            <w:r/>
+            <w:r>
+              <w:rPr>
+                <w:b w:val="0"/>
+                <w:sz w:val="16"/>
+              </w:rPr>
+              <w:t>226</w:t>
+            </w:r>
+          </w:p>
+        </w:tc>
+        <w:tc>
+          <w:tcPr>
+            <w:tcW w:type="dxa" w:w="1417"/>
+            <w:shd w:fill="D5F5E3"/>
+          </w:tcPr>
+          <w:p>
+            <w:pPr>
+              <w:jc w:val="center"/>
+            </w:pPr>
+            <w:r/>
+            <w:r>
+              <w:rPr>
+                <w:b/>
+                <w:sz w:val="16"/>
+              </w:rPr>
+              <w:t>Contrebasson</w:t>
+            </w:r>
+          </w:p>
+        </w:tc>
+        <w:tc>
+          <w:tcPr>
+            <w:tcW w:type="dxa" w:w="624"/>
+            <w:shd w:fill="D5F5E3"/>
+          </w:tcPr>
+          <w:p>
+            <w:pPr>
+              <w:jc w:val="center"/>
+            </w:pPr>
+            <w:r/>
+            <w:r>
+              <w:rPr>
+                <w:b w:val="0"/>
+                <w:sz w:val="16"/>
+              </w:rPr>
+              <w:t>226</w:t>
+            </w:r>
+          </w:p>
+        </w:tc>
+        <w:tc>
+          <w:tcPr>
+            <w:tcW w:type="dxa" w:w="624"/>
+            <w:shd w:fill="D5F5E3"/>
+          </w:tcPr>
+          <w:p>
+            <w:pPr>
+              <w:jc w:val="center"/>
+            </w:pPr>
+            <w:r/>
+            <w:r>
+              <w:rPr>
+                <w:b w:val="0"/>
+                <w:sz w:val="16"/>
+              </w:rPr>
+              <w:t>0</w:t>
+            </w:r>
+          </w:p>
+        </w:tc>
+        <w:tc>
+          <w:tcPr>
+            <w:tcW w:type="dxa" w:w="1247"/>
+            <w:shd w:fill="D5F5E3"/>
+          </w:tcPr>
+          <w:p>
+            <w:pPr>
+              <w:jc w:val="center"/>
+            </w:pPr>
+            <w:r/>
+            <w:r>
+              <w:rPr>
+                <w:b w:val="0"/>
+                <w:sz w:val="16"/>
+              </w:rPr>
+              <w:t>Quasi-parfaite ★</w:t>
+            </w:r>
+          </w:p>
+        </w:tc>
+        <w:tc>
+          <w:tcPr>
+            <w:tcW w:type="dxa" w:w="510"/>
+            <w:shd w:fill="D5F5E3"/>
+          </w:tcPr>
+          <w:p>
+            <w:pPr>
+              <w:jc w:val="center"/>
+            </w:pPr>
+            <w:r/>
+            <w:r>
+              <w:rPr>
+                <w:b w:val="0"/>
+                <w:sz w:val="16"/>
+              </w:rPr>
+              <w:t>/u/</w:t>
+            </w:r>
+          </w:p>
+        </w:tc>
+        <w:tc>
+          <w:tcPr>
+            <w:tcW w:type="dxa" w:w="1020"/>
+            <w:shd w:fill="D5F5E3"/>
+          </w:tcPr>
+          <w:p>
+            <w:pPr>
+              <w:jc w:val="center"/>
+            </w:pPr>
+            <w:r/>
+            <w:r>
+              <w:rPr>
+                <w:b w:val="0"/>
+                <w:sz w:val="16"/>
+              </w:rPr>
+              <w:t>Unisson</w:t>
+            </w:r>
+          </w:p>
+        </w:tc>
+      </w:tr>
+      <w:tr>
+        <w:tc>
+          <w:tcPr>
+            <w:tcW w:type="dxa" w:w="1417"/>
+            <w:shd w:fill="D5F5E3"/>
+          </w:tcPr>
+          <w:p>
+            <w:pPr>
+              <w:jc w:val="center"/>
+            </w:pPr>
+            <w:r/>
+            <w:r>
+              <w:rPr>
+                <w:b/>
+                <w:sz w:val="16"/>
+              </w:rPr>
+              <w:t>Tuba CB</w:t>
+            </w:r>
+          </w:p>
+        </w:tc>
+        <w:tc>
+          <w:tcPr>
+            <w:tcW w:type="dxa" w:w="624"/>
+            <w:shd w:fill="D5F5E3"/>
+          </w:tcPr>
+          <w:p>
+            <w:pPr>
+              <w:jc w:val="center"/>
+            </w:pPr>
+            <w:r/>
+            <w:r>
+              <w:rPr>
+                <w:b w:val="0"/>
+                <w:sz w:val="16"/>
+              </w:rPr>
+              <w:t>226</w:t>
+            </w:r>
+          </w:p>
+        </w:tc>
+        <w:tc>
+          <w:tcPr>
+            <w:tcW w:type="dxa" w:w="1417"/>
+            <w:shd w:fill="D5F5E3"/>
+          </w:tcPr>
+          <w:p>
+            <w:pPr>
+              <w:jc w:val="center"/>
+            </w:pPr>
+            <w:r/>
+            <w:r>
+              <w:rPr>
+                <w:b/>
+                <w:sz w:val="16"/>
+              </w:rPr>
+              <w:t>Tuba basse</w:t>
+            </w:r>
+          </w:p>
+        </w:tc>
+        <w:tc>
+          <w:tcPr>
+            <w:tcW w:type="dxa" w:w="624"/>
+            <w:shd w:fill="D5F5E3"/>
+          </w:tcPr>
+          <w:p>
+            <w:pPr>
+              <w:jc w:val="center"/>
+            </w:pPr>
+            <w:r/>
+            <w:r>
+              <w:rPr>
+                <w:b w:val="0"/>
+                <w:sz w:val="16"/>
+              </w:rPr>
+              <w:t>226</w:t>
+            </w:r>
+          </w:p>
+        </w:tc>
+        <w:tc>
+          <w:tcPr>
+            <w:tcW w:type="dxa" w:w="624"/>
+            <w:shd w:fill="D5F5E3"/>
+          </w:tcPr>
+          <w:p>
+            <w:pPr>
+              <w:jc w:val="center"/>
+            </w:pPr>
+            <w:r/>
+            <w:r>
+              <w:rPr>
+                <w:b w:val="0"/>
+                <w:sz w:val="16"/>
+              </w:rPr>
+              <w:t>0</w:t>
+            </w:r>
+          </w:p>
+        </w:tc>
+        <w:tc>
+          <w:tcPr>
+            <w:tcW w:type="dxa" w:w="1247"/>
+            <w:shd w:fill="D5F5E3"/>
+          </w:tcPr>
+          <w:p>
+            <w:pPr>
+              <w:jc w:val="center"/>
+            </w:pPr>
+            <w:r/>
+            <w:r>
+              <w:rPr>
+                <w:b w:val="0"/>
+                <w:sz w:val="16"/>
+              </w:rPr>
+              <w:t>Quasi-parfaite ★</w:t>
+            </w:r>
+          </w:p>
+        </w:tc>
+        <w:tc>
+          <w:tcPr>
+            <w:tcW w:type="dxa" w:w="510"/>
+            <w:shd w:fill="D5F5E3"/>
+          </w:tcPr>
+          <w:p>
+            <w:pPr>
+              <w:jc w:val="center"/>
+            </w:pPr>
+            <w:r/>
+            <w:r>
+              <w:rPr>
+                <w:b w:val="0"/>
+                <w:sz w:val="16"/>
+              </w:rPr>
+              <w:t>/u/</w:t>
+            </w:r>
+          </w:p>
+        </w:tc>
+        <w:tc>
+          <w:tcPr>
+            <w:tcW w:type="dxa" w:w="1020"/>
+            <w:shd w:fill="D5F5E3"/>
+          </w:tcPr>
+          <w:p>
+            <w:pPr>
+              <w:jc w:val="center"/>
+            </w:pPr>
+            <w:r/>
+            <w:r>
+              <w:rPr>
+                <w:b w:val="0"/>
+                <w:sz w:val="16"/>
+              </w:rPr>
+              <w:t>Octave</w:t>
+            </w:r>
+          </w:p>
+        </w:tc>
+      </w:tr>
+      <w:tr>
+        <w:tc>
+          <w:tcPr>
+            <w:tcW w:type="dxa" w:w="1417"/>
+            <w:shd w:fill="D5F5E3"/>
+          </w:tcPr>
+          <w:p>
+            <w:pPr>
+              <w:jc w:val="center"/>
+            </w:pPr>
+            <w:r/>
+            <w:r>
+              <w:rPr>
+                <w:b/>
+                <w:sz w:val="16"/>
+              </w:rPr>
+              <w:t>Cor</w:t>
+            </w:r>
+          </w:p>
+        </w:tc>
+        <w:tc>
+          <w:tcPr>
+            <w:tcW w:type="dxa" w:w="624"/>
+            <w:shd w:fill="D5F5E3"/>
+          </w:tcPr>
+          <w:p>
+            <w:pPr>
+              <w:jc w:val="center"/>
+            </w:pPr>
+            <w:r/>
+            <w:r>
+              <w:rPr>
+                <w:b w:val="0"/>
+                <w:sz w:val="16"/>
+              </w:rPr>
+              <w:t>388</w:t>
+            </w:r>
+          </w:p>
+        </w:tc>
+        <w:tc>
+          <w:tcPr>
+            <w:tcW w:type="dxa" w:w="1417"/>
+            <w:shd w:fill="D5F5E3"/>
+          </w:tcPr>
+          <w:p>
+            <w:pPr>
+              <w:jc w:val="center"/>
+            </w:pPr>
+            <w:r/>
+            <w:r>
+              <w:rPr>
+                <w:b/>
+                <w:sz w:val="16"/>
+              </w:rPr>
+              <w:t>Alto</w:t>
+            </w:r>
+          </w:p>
+        </w:tc>
+        <w:tc>
+          <w:tcPr>
+            <w:tcW w:type="dxa" w:w="624"/>
+            <w:shd w:fill="D5F5E3"/>
+          </w:tcPr>
+          <w:p>
+            <w:pPr>
+              <w:jc w:val="center"/>
+            </w:pPr>
+            <w:r/>
+            <w:r>
+              <w:rPr>
+                <w:b w:val="0"/>
+                <w:sz w:val="16"/>
+              </w:rPr>
+              <w:t>377</w:t>
+            </w:r>
+          </w:p>
+        </w:tc>
+        <w:tc>
+          <w:tcPr>
+            <w:tcW w:type="dxa" w:w="624"/>
+            <w:shd w:fill="D5F5E3"/>
+          </w:tcPr>
+          <w:p>
+            <w:pPr>
+              <w:jc w:val="center"/>
+            </w:pPr>
+            <w:r/>
+            <w:r>
+              <w:rPr>
+                <w:b w:val="0"/>
+                <w:sz w:val="16"/>
+              </w:rPr>
+              <w:t>11</w:t>
+            </w:r>
+          </w:p>
+        </w:tc>
+        <w:tc>
+          <w:tcPr>
+            <w:tcW w:type="dxa" w:w="1247"/>
+            <w:shd w:fill="D5F5E3"/>
+          </w:tcPr>
+          <w:p>
+            <w:pPr>
+              <w:jc w:val="center"/>
+            </w:pPr>
+            <w:r/>
+            <w:r>
+              <w:rPr>
+                <w:b w:val="0"/>
+                <w:sz w:val="16"/>
+              </w:rPr>
+              <w:t>Quasi-parfaite</w:t>
             </w:r>
           </w:p>
         </w:tc>
@@ -1312,7 +1957,7 @@
                 <w:b/>
                 <w:sz w:val="16"/>
               </w:rPr>
-              <w:t>Cor</w:t>
+              <w:t>Cl. Sib</w:t>
             </w:r>
           </w:p>
         </w:tc>
@@ -1331,7 +1976,7 @@
                 <w:b w:val="0"/>
                 <w:sz w:val="16"/>
               </w:rPr>
-              <w:t>457</w:t>
+              <w:t>463</w:t>
             </w:r>
           </w:p>
         </w:tc>
@@ -1350,7 +1995,161 @@
                 <w:b w:val="0"/>
                 <w:sz w:val="16"/>
               </w:rPr>
-              <w:t>5</w:t>
+              <w:t>11</w:t>
+            </w:r>
+          </w:p>
+        </w:tc>
+        <w:tc>
+          <w:tcPr>
+            <w:tcW w:type="dxa" w:w="1247"/>
+            <w:shd w:fill="D5F5E3"/>
+          </w:tcPr>
+          <w:p>
+            <w:pPr>
+              <w:jc w:val="center"/>
+            </w:pPr>
+            <w:r/>
+            <w:r>
+              <w:rPr>
+                <w:b w:val="0"/>
+                <w:sz w:val="16"/>
+              </w:rPr>
+              <w:t>Quasi-parfaite</w:t>
+            </w:r>
+          </w:p>
+        </w:tc>
+        <w:tc>
+          <w:tcPr>
+            <w:tcW w:type="dxa" w:w="510"/>
+            <w:shd w:fill="D5F5E3"/>
+          </w:tcPr>
+          <w:p>
+            <w:pPr>
+              <w:jc w:val="center"/>
+            </w:pPr>
+            <w:r/>
+            <w:r>
+              <w:rPr>
+                <w:b w:val="0"/>
+                <w:sz w:val="16"/>
+              </w:rPr>
+              <w:t>/o/</w:t>
+            </w:r>
+          </w:p>
+        </w:tc>
+        <w:tc>
+          <w:tcPr>
+            <w:tcW w:type="dxa" w:w="1020"/>
+            <w:shd w:fill="D5F5E3"/>
+          </w:tcPr>
+          <w:p>
+            <w:pPr>
+              <w:jc w:val="center"/>
+            </w:pPr>
+            <w:r/>
+            <w:r>
+              <w:rPr>
+                <w:b w:val="0"/>
+                <w:sz w:val="16"/>
+              </w:rPr>
+              <w:t>Unisson</w:t>
+            </w:r>
+          </w:p>
+        </w:tc>
+      </w:tr>
+      <w:tr>
+        <w:tc>
+          <w:tcPr>
+            <w:tcW w:type="dxa" w:w="1417"/>
+            <w:shd w:fill="D5F5E3"/>
+          </w:tcPr>
+          <w:p>
+            <w:pPr>
+              <w:jc w:val="center"/>
+            </w:pPr>
+            <w:r/>
+            <w:r>
+              <w:rPr>
+                <w:b/>
+                <w:sz w:val="16"/>
+              </w:rPr>
+              <w:t>Violon</w:t>
+            </w:r>
+          </w:p>
+        </w:tc>
+        <w:tc>
+          <w:tcPr>
+            <w:tcW w:type="dxa" w:w="624"/>
+            <w:shd w:fill="D5F5E3"/>
+          </w:tcPr>
+          <w:p>
+            <w:pPr>
+              <w:jc w:val="center"/>
+            </w:pPr>
+            <w:r/>
+            <w:r>
+              <w:rPr>
+                <w:b w:val="0"/>
+                <w:sz w:val="16"/>
+              </w:rPr>
+              <w:t>506</w:t>
+            </w:r>
+          </w:p>
+        </w:tc>
+        <w:tc>
+          <w:tcPr>
+            <w:tcW w:type="dxa" w:w="1417"/>
+            <w:shd w:fill="D5F5E3"/>
+          </w:tcPr>
+          <w:p>
+            <w:pPr>
+              <w:jc w:val="center"/>
+            </w:pPr>
+            <w:r/>
+            <w:r>
+              <w:rPr>
+                <w:b/>
+                <w:sz w:val="16"/>
+              </w:rPr>
+              <w:t>Basson</w:t>
+            </w:r>
+          </w:p>
+        </w:tc>
+        <w:tc>
+          <w:tcPr>
+            <w:tcW w:type="dxa" w:w="624"/>
+            <w:shd w:fill="D5F5E3"/>
+          </w:tcPr>
+          <w:p>
+            <w:pPr>
+              <w:jc w:val="center"/>
+            </w:pPr>
+            <w:r/>
+            <w:r>
+              <w:rPr>
+                <w:b w:val="0"/>
+                <w:sz w:val="16"/>
+              </w:rPr>
+              <w:t>495</w:t>
+            </w:r>
+          </w:p>
+        </w:tc>
+        <w:tc>
+          <w:tcPr>
+            <w:tcW w:type="dxa" w:w="624"/>
+            <w:shd w:fill="D5F5E3"/>
+          </w:tcPr>
+          <w:p>
+            <w:pPr>
+              <w:jc w:val="center"/>
+            </w:pPr>
+            <w:r/>
+            <w:r>
+              <w:rPr>
+                <w:b w:val="0"/>
+                <w:sz w:val="16"/>
+              </w:rPr>
+              <w:t>11</w:t>
             </w:r>
           </w:p>
         </w:tc>
@@ -1447,7 +2246,7 @@
                 <w:b w:val="0"/>
                 <w:sz w:val="16"/>
               </w:rPr>
-              <w:t>491</w:t>
+              <w:t>237</w:t>
             </w:r>
           </w:p>
         </w:tc>
@@ -1466,7 +2265,7 @@
                 <w:b/>
                 <w:sz w:val="16"/>
               </w:rPr>
-              <w:t>Violoncelle</w:t>
+              <w:t>Tuba basse</w:t>
             </w:r>
           </w:p>
         </w:tc>
@@ -1485,7 +2284,7 @@
                 <w:b w:val="0"/>
                 <w:sz w:val="16"/>
               </w:rPr>
-              <w:t>499</w:t>
+              <w:t>226</w:t>
             </w:r>
           </w:p>
         </w:tc>
@@ -1504,7 +2303,7 @@
                 <w:b w:val="0"/>
                 <w:sz w:val="16"/>
               </w:rPr>
-              <w:t>8</w:t>
+              <w:t>11</w:t>
             </w:r>
           </w:p>
         </w:tc>
@@ -1542,7 +2341,315 @@
                 <w:b w:val="0"/>
                 <w:sz w:val="16"/>
               </w:rPr>
-              <w:t>/o/</w:t>
+              <w:t>/u/</w:t>
+            </w:r>
+          </w:p>
+        </w:tc>
+        <w:tc>
+          <w:tcPr>
+            <w:tcW w:type="dxa" w:w="1020"/>
+            <w:shd w:fill="D5F5E3"/>
+          </w:tcPr>
+          <w:p>
+            <w:pPr>
+              <w:jc w:val="center"/>
+            </w:pPr>
+            <w:r/>
+            <w:r>
+              <w:rPr>
+                <w:b w:val="0"/>
+                <w:sz w:val="16"/>
+              </w:rPr>
+              <w:t>Octave</w:t>
+            </w:r>
+          </w:p>
+        </w:tc>
+      </w:tr>
+      <w:tr>
+        <w:tc>
+          <w:tcPr>
+            <w:tcW w:type="dxa" w:w="1417"/>
+            <w:shd w:fill="D5F5E3"/>
+          </w:tcPr>
+          <w:p>
+            <w:pPr>
+              <w:jc w:val="center"/>
+            </w:pPr>
+            <w:r/>
+            <w:r>
+              <w:rPr>
+                <w:b/>
+                <w:sz w:val="16"/>
+              </w:rPr>
+              <w:t>Trombone</w:t>
+            </w:r>
+          </w:p>
+        </w:tc>
+        <w:tc>
+          <w:tcPr>
+            <w:tcW w:type="dxa" w:w="624"/>
+            <w:shd w:fill="D5F5E3"/>
+          </w:tcPr>
+          <w:p>
+            <w:pPr>
+              <w:jc w:val="center"/>
+            </w:pPr>
+            <w:r/>
+            <w:r>
+              <w:rPr>
+                <w:b w:val="0"/>
+                <w:sz w:val="16"/>
+              </w:rPr>
+              <w:t>237</w:t>
+            </w:r>
+          </w:p>
+        </w:tc>
+        <w:tc>
+          <w:tcPr>
+            <w:tcW w:type="dxa" w:w="1417"/>
+            <w:shd w:fill="D5F5E3"/>
+          </w:tcPr>
+          <w:p>
+            <w:pPr>
+              <w:jc w:val="center"/>
+            </w:pPr>
+            <w:r/>
+            <w:r>
+              <w:rPr>
+                <w:b/>
+                <w:sz w:val="16"/>
+              </w:rPr>
+              <w:t>Tuba CB</w:t>
+            </w:r>
+          </w:p>
+        </w:tc>
+        <w:tc>
+          <w:tcPr>
+            <w:tcW w:type="dxa" w:w="624"/>
+            <w:shd w:fill="D5F5E3"/>
+          </w:tcPr>
+          <w:p>
+            <w:pPr>
+              <w:jc w:val="center"/>
+            </w:pPr>
+            <w:r/>
+            <w:r>
+              <w:rPr>
+                <w:b w:val="0"/>
+                <w:sz w:val="16"/>
+              </w:rPr>
+              <w:t>226</w:t>
+            </w:r>
+          </w:p>
+        </w:tc>
+        <w:tc>
+          <w:tcPr>
+            <w:tcW w:type="dxa" w:w="624"/>
+            <w:shd w:fill="D5F5E3"/>
+          </w:tcPr>
+          <w:p>
+            <w:pPr>
+              <w:jc w:val="center"/>
+            </w:pPr>
+            <w:r/>
+            <w:r>
+              <w:rPr>
+                <w:b w:val="0"/>
+                <w:sz w:val="16"/>
+              </w:rPr>
+              <w:t>11</w:t>
+            </w:r>
+          </w:p>
+        </w:tc>
+        <w:tc>
+          <w:tcPr>
+            <w:tcW w:type="dxa" w:w="1247"/>
+            <w:shd w:fill="D5F5E3"/>
+          </w:tcPr>
+          <w:p>
+            <w:pPr>
+              <w:jc w:val="center"/>
+            </w:pPr>
+            <w:r/>
+            <w:r>
+              <w:rPr>
+                <w:b w:val="0"/>
+                <w:sz w:val="16"/>
+              </w:rPr>
+              <w:t>Quasi-parfaite</w:t>
+            </w:r>
+          </w:p>
+        </w:tc>
+        <w:tc>
+          <w:tcPr>
+            <w:tcW w:type="dxa" w:w="510"/>
+            <w:shd w:fill="D5F5E3"/>
+          </w:tcPr>
+          <w:p>
+            <w:pPr>
+              <w:jc w:val="center"/>
+            </w:pPr>
+            <w:r/>
+            <w:r>
+              <w:rPr>
+                <w:b w:val="0"/>
+                <w:sz w:val="16"/>
+              </w:rPr>
+              <w:t>/u/</w:t>
+            </w:r>
+          </w:p>
+        </w:tc>
+        <w:tc>
+          <w:tcPr>
+            <w:tcW w:type="dxa" w:w="1020"/>
+            <w:shd w:fill="D5F5E3"/>
+          </w:tcPr>
+          <w:p>
+            <w:pPr>
+              <w:jc w:val="center"/>
+            </w:pPr>
+            <w:r/>
+            <w:r>
+              <w:rPr>
+                <w:b w:val="0"/>
+                <w:sz w:val="16"/>
+              </w:rPr>
+              <w:t>Octave</w:t>
+            </w:r>
+          </w:p>
+        </w:tc>
+      </w:tr>
+      <w:tr>
+        <w:tc>
+          <w:tcPr>
+            <w:tcW w:type="dxa" w:w="1417"/>
+            <w:shd w:fill="D5F5E3"/>
+          </w:tcPr>
+          <w:p>
+            <w:pPr>
+              <w:jc w:val="center"/>
+            </w:pPr>
+            <w:r/>
+            <w:r>
+              <w:rPr>
+                <w:b/>
+                <w:sz w:val="16"/>
+              </w:rPr>
+              <w:t>Trombone</w:t>
+            </w:r>
+          </w:p>
+        </w:tc>
+        <w:tc>
+          <w:tcPr>
+            <w:tcW w:type="dxa" w:w="624"/>
+            <w:shd w:fill="D5F5E3"/>
+          </w:tcPr>
+          <w:p>
+            <w:pPr>
+              <w:jc w:val="center"/>
+            </w:pPr>
+            <w:r/>
+            <w:r>
+              <w:rPr>
+                <w:b w:val="0"/>
+                <w:sz w:val="16"/>
+              </w:rPr>
+              <w:t>237</w:t>
+            </w:r>
+          </w:p>
+        </w:tc>
+        <w:tc>
+          <w:tcPr>
+            <w:tcW w:type="dxa" w:w="1417"/>
+            <w:shd w:fill="D5F5E3"/>
+          </w:tcPr>
+          <w:p>
+            <w:pPr>
+              <w:jc w:val="center"/>
+            </w:pPr>
+            <w:r/>
+            <w:r>
+              <w:rPr>
+                <w:b/>
+                <w:sz w:val="16"/>
+              </w:rPr>
+              <w:t>Contrebasson</w:t>
+            </w:r>
+          </w:p>
+        </w:tc>
+        <w:tc>
+          <w:tcPr>
+            <w:tcW w:type="dxa" w:w="624"/>
+            <w:shd w:fill="D5F5E3"/>
+          </w:tcPr>
+          <w:p>
+            <w:pPr>
+              <w:jc w:val="center"/>
+            </w:pPr>
+            <w:r/>
+            <w:r>
+              <w:rPr>
+                <w:b w:val="0"/>
+                <w:sz w:val="16"/>
+              </w:rPr>
+              <w:t>226</w:t>
+            </w:r>
+          </w:p>
+        </w:tc>
+        <w:tc>
+          <w:tcPr>
+            <w:tcW w:type="dxa" w:w="624"/>
+            <w:shd w:fill="D5F5E3"/>
+          </w:tcPr>
+          <w:p>
+            <w:pPr>
+              <w:jc w:val="center"/>
+            </w:pPr>
+            <w:r/>
+            <w:r>
+              <w:rPr>
+                <w:b w:val="0"/>
+                <w:sz w:val="16"/>
+              </w:rPr>
+              <w:t>11</w:t>
+            </w:r>
+          </w:p>
+        </w:tc>
+        <w:tc>
+          <w:tcPr>
+            <w:tcW w:type="dxa" w:w="1247"/>
+            <w:shd w:fill="D5F5E3"/>
+          </w:tcPr>
+          <w:p>
+            <w:pPr>
+              <w:jc w:val="center"/>
+            </w:pPr>
+            <w:r/>
+            <w:r>
+              <w:rPr>
+                <w:b w:val="0"/>
+                <w:sz w:val="16"/>
+              </w:rPr>
+              <w:t>Quasi-parfaite</w:t>
+            </w:r>
+          </w:p>
+        </w:tc>
+        <w:tc>
+          <w:tcPr>
+            <w:tcW w:type="dxa" w:w="510"/>
+            <w:shd w:fill="D5F5E3"/>
+          </w:tcPr>
+          <w:p>
+            <w:pPr>
+              <w:jc w:val="center"/>
+            </w:pPr>
+            <w:r/>
+            <w:r>
+              <w:rPr>
+                <w:b w:val="0"/>
+                <w:sz w:val="16"/>
+              </w:rPr>
+              <w:t>/u/</w:t>
             </w:r>
           </w:p>
         </w:tc>
@@ -1601,280 +2708,10 @@
                 <w:b w:val="0"/>
                 <w:sz w:val="16"/>
               </w:rPr>
-              <w:t>491</w:t>
+              <w:t>237</w:t>
             </w:r>
           </w:p>
         </w:tc>
-        <w:tc>
-          <w:tcPr>
-            <w:tcW w:type="dxa" w:w="1417"/>
-            <w:shd w:fill="D5F5E3"/>
-          </w:tcPr>
-          <w:p>
-            <w:pPr>
-              <w:jc w:val="center"/>
-            </w:pPr>
-            <w:r/>
-            <w:r>
-              <w:rPr>
-                <w:b/>
-                <w:sz w:val="16"/>
-              </w:rPr>
-              <w:t>Basson</w:t>
-            </w:r>
-          </w:p>
-        </w:tc>
-        <w:tc>
-          <w:tcPr>
-            <w:tcW w:type="dxa" w:w="624"/>
-            <w:shd w:fill="D5F5E3"/>
-          </w:tcPr>
-          <w:p>
-            <w:pPr>
-              <w:jc w:val="center"/>
-            </w:pPr>
-            <w:r/>
-            <w:r>
-              <w:rPr>
-                <w:b w:val="0"/>
-                <w:sz w:val="16"/>
-              </w:rPr>
-              <w:t>502</w:t>
-            </w:r>
-          </w:p>
-        </w:tc>
-        <w:tc>
-          <w:tcPr>
-            <w:tcW w:type="dxa" w:w="624"/>
-            <w:shd w:fill="D5F5E3"/>
-          </w:tcPr>
-          <w:p>
-            <w:pPr>
-              <w:jc w:val="center"/>
-            </w:pPr>
-            <w:r/>
-            <w:r>
-              <w:rPr>
-                <w:b w:val="0"/>
-                <w:sz w:val="16"/>
-              </w:rPr>
-              <w:t>11</w:t>
-            </w:r>
-          </w:p>
-        </w:tc>
-        <w:tc>
-          <w:tcPr>
-            <w:tcW w:type="dxa" w:w="1247"/>
-            <w:shd w:fill="D5F5E3"/>
-          </w:tcPr>
-          <w:p>
-            <w:pPr>
-              <w:jc w:val="center"/>
-            </w:pPr>
-            <w:r/>
-            <w:r>
-              <w:rPr>
-                <w:b w:val="0"/>
-                <w:sz w:val="16"/>
-              </w:rPr>
-              <w:t>Quasi-parfaite</w:t>
-            </w:r>
-          </w:p>
-        </w:tc>
-        <w:tc>
-          <w:tcPr>
-            <w:tcW w:type="dxa" w:w="510"/>
-            <w:shd w:fill="D5F5E3"/>
-          </w:tcPr>
-          <w:p>
-            <w:pPr>
-              <w:jc w:val="center"/>
-            </w:pPr>
-            <w:r/>
-            <w:r>
-              <w:rPr>
-                <w:b w:val="0"/>
-                <w:sz w:val="16"/>
-              </w:rPr>
-              <w:t>/o/</w:t>
-            </w:r>
-          </w:p>
-        </w:tc>
-        <w:tc>
-          <w:tcPr>
-            <w:tcW w:type="dxa" w:w="1020"/>
-            <w:shd w:fill="D5F5E3"/>
-          </w:tcPr>
-          <w:p>
-            <w:pPr>
-              <w:jc w:val="center"/>
-            </w:pPr>
-            <w:r/>
-            <w:r>
-              <w:rPr>
-                <w:b w:val="0"/>
-                <w:sz w:val="16"/>
-              </w:rPr>
-              <w:t>Unisson</w:t>
-            </w:r>
-          </w:p>
-        </w:tc>
-      </w:tr>
-      <w:tr>
-        <w:tc>
-          <w:tcPr>
-            <w:tcW w:type="dxa" w:w="1417"/>
-            <w:shd w:fill="D5F5E3"/>
-          </w:tcPr>
-          <w:p>
-            <w:pPr>
-              <w:jc w:val="center"/>
-            </w:pPr>
-            <w:r/>
-            <w:r>
-              <w:rPr>
-                <w:b/>
-                <w:sz w:val="16"/>
-              </w:rPr>
-              <w:t>Cor</w:t>
-            </w:r>
-          </w:p>
-        </w:tc>
-        <w:tc>
-          <w:tcPr>
-            <w:tcW w:type="dxa" w:w="624"/>
-            <w:shd w:fill="D5F5E3"/>
-          </w:tcPr>
-          <w:p>
-            <w:pPr>
-              <w:jc w:val="center"/>
-            </w:pPr>
-            <w:r/>
-            <w:r>
-              <w:rPr>
-                <w:b w:val="0"/>
-                <w:sz w:val="16"/>
-              </w:rPr>
-              <w:t>457</w:t>
-            </w:r>
-          </w:p>
-        </w:tc>
-        <w:tc>
-          <w:tcPr>
-            <w:tcW w:type="dxa" w:w="1417"/>
-            <w:shd w:fill="D5F5E3"/>
-          </w:tcPr>
-          <w:p>
-            <w:pPr>
-              <w:jc w:val="center"/>
-            </w:pPr>
-            <w:r/>
-            <w:r>
-              <w:rPr>
-                <w:b/>
-                <w:sz w:val="16"/>
-              </w:rPr>
-              <w:t>Tuba contrebasse</w:t>
-            </w:r>
-          </w:p>
-        </w:tc>
-        <w:tc>
-          <w:tcPr>
-            <w:tcW w:type="dxa" w:w="624"/>
-            <w:shd w:fill="D5F5E3"/>
-          </w:tcPr>
-          <w:p>
-            <w:pPr>
-              <w:jc w:val="center"/>
-            </w:pPr>
-            <w:r/>
-            <w:r>
-              <w:rPr>
-                <w:b w:val="0"/>
-                <w:sz w:val="16"/>
-              </w:rPr>
-              <w:t>471</w:t>
-            </w:r>
-          </w:p>
-        </w:tc>
-        <w:tc>
-          <w:tcPr>
-            <w:tcW w:type="dxa" w:w="624"/>
-            <w:shd w:fill="D5F5E3"/>
-          </w:tcPr>
-          <w:p>
-            <w:pPr>
-              <w:jc w:val="center"/>
-            </w:pPr>
-            <w:r/>
-            <w:r>
-              <w:rPr>
-                <w:b w:val="0"/>
-                <w:sz w:val="16"/>
-              </w:rPr>
-              <w:t>14</w:t>
-            </w:r>
-          </w:p>
-        </w:tc>
-        <w:tc>
-          <w:tcPr>
-            <w:tcW w:type="dxa" w:w="1247"/>
-            <w:shd w:fill="D5F5E3"/>
-          </w:tcPr>
-          <w:p>
-            <w:pPr>
-              <w:jc w:val="center"/>
-            </w:pPr>
-            <w:r/>
-            <w:r>
-              <w:rPr>
-                <w:b w:val="0"/>
-                <w:sz w:val="16"/>
-              </w:rPr>
-              <w:t>Quasi-parfaite</w:t>
-            </w:r>
-          </w:p>
-        </w:tc>
-        <w:tc>
-          <w:tcPr>
-            <w:tcW w:type="dxa" w:w="510"/>
-            <w:shd w:fill="D5F5E3"/>
-          </w:tcPr>
-          <w:p>
-            <w:pPr>
-              <w:jc w:val="center"/>
-            </w:pPr>
-            <w:r/>
-            <w:r>
-              <w:rPr>
-                <w:b w:val="0"/>
-                <w:sz w:val="16"/>
-              </w:rPr>
-              <w:t>/o/</w:t>
-            </w:r>
-          </w:p>
-        </w:tc>
-        <w:tc>
-          <w:tcPr>
-            <w:tcW w:type="dxa" w:w="1020"/>
-            <w:shd w:fill="D5F5E3"/>
-          </w:tcPr>
-          <w:p>
-            <w:pPr>
-              <w:jc w:val="center"/>
-            </w:pPr>
-            <w:r/>
-            <w:r>
-              <w:rPr>
-                <w:b w:val="0"/>
-                <w:sz w:val="16"/>
-              </w:rPr>
-              <w:t>Octave</w:t>
-            </w:r>
-          </w:p>
-        </w:tc>
-      </w:tr>
-      <w:tr>
         <w:tc>
           <w:tcPr>
             <w:tcW w:type="dxa" w:w="1417"/>
@@ -1909,26 +2746,7 @@
                 <w:b w:val="0"/>
                 <w:sz w:val="16"/>
               </w:rPr>
-              <w:t>894</w:t>
-            </w:r>
-          </w:p>
-        </w:tc>
-        <w:tc>
-          <w:tcPr>
-            <w:tcW w:type="dxa" w:w="1417"/>
-            <w:shd w:fill="D5F5E3"/>
-          </w:tcPr>
-          <w:p>
-            <w:pPr>
-              <w:jc w:val="center"/>
-            </w:pPr>
-            <w:r/>
-            <w:r>
-              <w:rPr>
-                <w:b/>
-                <w:sz w:val="16"/>
-              </w:rPr>
-              <w:t>Cl. basse</w:t>
+              <w:t>258</w:t>
             </w:r>
           </w:p>
         </w:tc>
@@ -1947,26 +2765,7 @@
                 <w:b w:val="0"/>
                 <w:sz w:val="16"/>
               </w:rPr>
-              <w:t>909</w:t>
-            </w:r>
-          </w:p>
-        </w:tc>
-        <w:tc>
-          <w:tcPr>
-            <w:tcW w:type="dxa" w:w="624"/>
-            <w:shd w:fill="D5F5E3"/>
-          </w:tcPr>
-          <w:p>
-            <w:pPr>
-              <w:jc w:val="center"/>
-            </w:pPr>
-            <w:r/>
-            <w:r>
-              <w:rPr>
-                <w:b w:val="0"/>
-                <w:sz w:val="16"/>
-              </w:rPr>
-              <w:t>15</w:t>
+              <w:t>21</w:t>
             </w:r>
           </w:p>
         </w:tc>
@@ -1986,314 +2785,6 @@
                 <w:sz w:val="16"/>
               </w:rPr>
               <w:t>Quasi-parfaite</w:t>
-            </w:r>
-          </w:p>
-        </w:tc>
-        <w:tc>
-          <w:tcPr>
-            <w:tcW w:type="dxa" w:w="510"/>
-            <w:shd w:fill="D5F5E3"/>
-          </w:tcPr>
-          <w:p>
-            <w:pPr>
-              <w:jc w:val="center"/>
-            </w:pPr>
-            <w:r/>
-            <w:r>
-              <w:rPr>
-                <w:b w:val="0"/>
-                <w:sz w:val="16"/>
-              </w:rPr>
-              <w:t>/a/</w:t>
-            </w:r>
-          </w:p>
-        </w:tc>
-        <w:tc>
-          <w:tcPr>
-            <w:tcW w:type="dxa" w:w="1020"/>
-            <w:shd w:fill="D5F5E3"/>
-          </w:tcPr>
-          <w:p>
-            <w:pPr>
-              <w:jc w:val="center"/>
-            </w:pPr>
-            <w:r/>
-            <w:r>
-              <w:rPr>
-                <w:b w:val="0"/>
-                <w:sz w:val="16"/>
-              </w:rPr>
-              <w:t>Unisson</w:t>
-            </w:r>
-          </w:p>
-        </w:tc>
-      </w:tr>
-      <w:tr>
-        <w:tc>
-          <w:tcPr>
-            <w:tcW w:type="dxa" w:w="1417"/>
-            <w:shd w:fill="D5F5E3"/>
-          </w:tcPr>
-          <w:p>
-            <w:pPr>
-              <w:jc w:val="center"/>
-            </w:pPr>
-            <w:r/>
-            <w:r>
-              <w:rPr>
-                <w:b/>
-                <w:sz w:val="16"/>
-              </w:rPr>
-              <w:t>Trombone</w:t>
-            </w:r>
-          </w:p>
-        </w:tc>
-        <w:tc>
-          <w:tcPr>
-            <w:tcW w:type="dxa" w:w="624"/>
-            <w:shd w:fill="D5F5E3"/>
-          </w:tcPr>
-          <w:p>
-            <w:pPr>
-              <w:jc w:val="center"/>
-            </w:pPr>
-            <w:r/>
-            <w:r>
-              <w:rPr>
-                <w:b w:val="0"/>
-                <w:sz w:val="16"/>
-              </w:rPr>
-              <w:t>491</w:t>
-            </w:r>
-          </w:p>
-        </w:tc>
-        <w:tc>
-          <w:tcPr>
-            <w:tcW w:type="dxa" w:w="1417"/>
-            <w:shd w:fill="D5F5E3"/>
-          </w:tcPr>
-          <w:p>
-            <w:pPr>
-              <w:jc w:val="center"/>
-            </w:pPr>
-            <w:r/>
-            <w:r>
-              <w:rPr>
-                <w:b/>
-                <w:sz w:val="16"/>
-              </w:rPr>
-              <w:t>Tuba contrebasse</w:t>
-            </w:r>
-          </w:p>
-        </w:tc>
-        <w:tc>
-          <w:tcPr>
-            <w:tcW w:type="dxa" w:w="624"/>
-            <w:shd w:fill="D5F5E3"/>
-          </w:tcPr>
-          <w:p>
-            <w:pPr>
-              <w:jc w:val="center"/>
-            </w:pPr>
-            <w:r/>
-            <w:r>
-              <w:rPr>
-                <w:b w:val="0"/>
-                <w:sz w:val="16"/>
-              </w:rPr>
-              <w:t>471</w:t>
-            </w:r>
-          </w:p>
-        </w:tc>
-        <w:tc>
-          <w:tcPr>
-            <w:tcW w:type="dxa" w:w="624"/>
-            <w:shd w:fill="D5F5E3"/>
-          </w:tcPr>
-          <w:p>
-            <w:pPr>
-              <w:jc w:val="center"/>
-            </w:pPr>
-            <w:r/>
-            <w:r>
-              <w:rPr>
-                <w:b w:val="0"/>
-                <w:sz w:val="16"/>
-              </w:rPr>
-              <w:t>20</w:t>
-            </w:r>
-          </w:p>
-        </w:tc>
-        <w:tc>
-          <w:tcPr>
-            <w:tcW w:type="dxa" w:w="1247"/>
-            <w:shd w:fill="D5F5E3"/>
-          </w:tcPr>
-          <w:p>
-            <w:pPr>
-              <w:jc w:val="center"/>
-            </w:pPr>
-            <w:r/>
-            <w:r>
-              <w:rPr>
-                <w:b w:val="0"/>
-                <w:sz w:val="16"/>
-              </w:rPr>
-              <w:t>Quasi-parfaite</w:t>
-            </w:r>
-          </w:p>
-        </w:tc>
-        <w:tc>
-          <w:tcPr>
-            <w:tcW w:type="dxa" w:w="510"/>
-            <w:shd w:fill="D5F5E3"/>
-          </w:tcPr>
-          <w:p>
-            <w:pPr>
-              <w:jc w:val="center"/>
-            </w:pPr>
-            <w:r/>
-            <w:r>
-              <w:rPr>
-                <w:b w:val="0"/>
-                <w:sz w:val="16"/>
-              </w:rPr>
-              <w:t>/o/</w:t>
-            </w:r>
-          </w:p>
-        </w:tc>
-        <w:tc>
-          <w:tcPr>
-            <w:tcW w:type="dxa" w:w="1020"/>
-            <w:shd w:fill="D5F5E3"/>
-          </w:tcPr>
-          <w:p>
-            <w:pPr>
-              <w:jc w:val="center"/>
-            </w:pPr>
-            <w:r/>
-            <w:r>
-              <w:rPr>
-                <w:b w:val="0"/>
-                <w:sz w:val="16"/>
-              </w:rPr>
-              <w:t>Octave</w:t>
-            </w:r>
-          </w:p>
-        </w:tc>
-      </w:tr>
-      <w:tr>
-        <w:tc>
-          <w:tcPr>
-            <w:tcW w:type="dxa" w:w="1417"/>
-            <w:shd w:fill="D5F5E3"/>
-          </w:tcPr>
-          <w:p>
-            <w:pPr>
-              <w:jc w:val="center"/>
-            </w:pPr>
-            <w:r/>
-            <w:r>
-              <w:rPr>
-                <w:b/>
-                <w:sz w:val="16"/>
-              </w:rPr>
-              <w:t>Contrebasson</w:t>
-            </w:r>
-          </w:p>
-        </w:tc>
-        <w:tc>
-          <w:tcPr>
-            <w:tcW w:type="dxa" w:w="624"/>
-            <w:shd w:fill="D5F5E3"/>
-          </w:tcPr>
-          <w:p>
-            <w:pPr>
-              <w:jc w:val="center"/>
-            </w:pPr>
-            <w:r/>
-            <w:r>
-              <w:rPr>
-                <w:b w:val="0"/>
-                <w:sz w:val="16"/>
-              </w:rPr>
-              <w:t>226</w:t>
-            </w:r>
-          </w:p>
-        </w:tc>
-        <w:tc>
-          <w:tcPr>
-            <w:tcW w:type="dxa" w:w="1417"/>
-            <w:shd w:fill="D5F5E3"/>
-          </w:tcPr>
-          <w:p>
-            <w:pPr>
-              <w:jc w:val="center"/>
-            </w:pPr>
-            <w:r/>
-            <w:r>
-              <w:rPr>
-                <w:b/>
-                <w:sz w:val="16"/>
-              </w:rPr>
-              <w:t>Tuba basse</w:t>
-            </w:r>
-          </w:p>
-        </w:tc>
-        <w:tc>
-          <w:tcPr>
-            <w:tcW w:type="dxa" w:w="624"/>
-            <w:shd w:fill="D5F5E3"/>
-          </w:tcPr>
-          <w:p>
-            <w:pPr>
-              <w:jc w:val="center"/>
-            </w:pPr>
-            <w:r/>
-            <w:r>
-              <w:rPr>
-                <w:b w:val="0"/>
-                <w:sz w:val="16"/>
-              </w:rPr>
-              <w:t>249</w:t>
-            </w:r>
-          </w:p>
-        </w:tc>
-        <w:tc>
-          <w:tcPr>
-            <w:tcW w:type="dxa" w:w="624"/>
-            <w:shd w:fill="D5F5E3"/>
-          </w:tcPr>
-          <w:p>
-            <w:pPr>
-              <w:jc w:val="center"/>
-            </w:pPr>
-            <w:r/>
-            <w:r>
-              <w:rPr>
-                <w:b w:val="0"/>
-                <w:sz w:val="16"/>
-              </w:rPr>
-              <w:t>23</w:t>
-            </w:r>
-          </w:p>
-        </w:tc>
-        <w:tc>
-          <w:tcPr>
-            <w:tcW w:type="dxa" w:w="1247"/>
-            <w:shd w:fill="D5F5E3"/>
-          </w:tcPr>
-          <w:p>
-            <w:pPr>
-              <w:jc w:val="center"/>
-            </w:pPr>
-            <w:r/>
-            <w:r>
-              <w:rPr>
-                <w:b w:val="0"/>
-                <w:sz w:val="16"/>
-              </w:rPr>
-              <w:t>Excellente</w:t>
             </w:r>
           </w:p>
         </w:tc>
@@ -2340,7 +2831,7 @@
         <w:tc>
           <w:tcPr>
             <w:tcW w:type="dxa" w:w="1417"/>
-            <w:shd w:fill="D5F5E3"/>
+            <w:shd w:fill="EAFAF1"/>
           </w:tcPr>
           <w:p>
             <w:pPr>
@@ -2359,7 +2850,7 @@
         <w:tc>
           <w:tcPr>
             <w:tcW w:type="dxa" w:w="624"/>
-            <w:shd w:fill="D5F5E3"/>
+            <w:shd w:fill="EAFAF1"/>
           </w:tcPr>
           <w:p>
             <w:pPr>
@@ -2378,7 +2869,7 @@
         <w:tc>
           <w:tcPr>
             <w:tcW w:type="dxa" w:w="1417"/>
-            <w:shd w:fill="D5F5E3"/>
+            <w:shd w:fill="EAFAF1"/>
           </w:tcPr>
           <w:p>
             <w:pPr>
@@ -2397,7 +2888,7 @@
         <w:tc>
           <w:tcPr>
             <w:tcW w:type="dxa" w:w="624"/>
-            <w:shd w:fill="D5F5E3"/>
+            <w:shd w:fill="EAFAF1"/>
           </w:tcPr>
           <w:p>
             <w:pPr>
@@ -2409,258 +2900,7 @@
                 <w:b w:val="0"/>
                 <w:sz w:val="16"/>
               </w:rPr>
-              <w:t>200</w:t>
-            </w:r>
-          </w:p>
-        </w:tc>
-        <w:tc>
-          <w:tcPr>
-            <w:tcW w:type="dxa" w:w="624"/>
-            <w:shd w:fill="D5F5E3"/>
-          </w:tcPr>
-          <w:p>
-            <w:pPr>
-              <w:jc w:val="center"/>
-            </w:pPr>
-            <w:r/>
-            <w:r>
-              <w:rPr>
-                <w:b w:val="0"/>
-                <w:sz w:val="16"/>
-              </w:rPr>
-              <w:t>26</w:t>
-            </w:r>
-          </w:p>
-        </w:tc>
-        <w:tc>
-          <w:tcPr>
-            <w:tcW w:type="dxa" w:w="1247"/>
-            <w:shd w:fill="D5F5E3"/>
-          </w:tcPr>
-          <w:p>
-            <w:pPr>
-              <w:jc w:val="center"/>
-            </w:pPr>
-            <w:r/>
-            <w:r>
-              <w:rPr>
-                <w:b w:val="0"/>
-                <w:sz w:val="16"/>
-              </w:rPr>
-              <w:t>Excellente</w:t>
-            </w:r>
-          </w:p>
-        </w:tc>
-        <w:tc>
-          <w:tcPr>
-            <w:tcW w:type="dxa" w:w="510"/>
-            <w:shd w:fill="D5F5E3"/>
-          </w:tcPr>
-          <w:p>
-            <w:pPr>
-              <w:jc w:val="center"/>
-            </w:pPr>
-            <w:r/>
-            <w:r>
-              <w:rPr>
-                <w:b w:val="0"/>
-                <w:sz w:val="16"/>
-              </w:rPr>
-              <w:t>/u/</w:t>
-            </w:r>
-          </w:p>
-        </w:tc>
-        <w:tc>
-          <w:tcPr>
-            <w:tcW w:type="dxa" w:w="1020"/>
-            <w:shd w:fill="D5F5E3"/>
-          </w:tcPr>
-          <w:p>
-            <w:pPr>
-              <w:jc w:val="center"/>
-            </w:pPr>
-            <w:r/>
-            <w:r>
-              <w:rPr>
-                <w:b w:val="0"/>
-                <w:sz w:val="16"/>
-              </w:rPr>
-              <w:t>Unisson</w:t>
-            </w:r>
-          </w:p>
-        </w:tc>
-      </w:tr>
-      <w:tr>
-        <w:tc>
-          <w:tcPr>
-            <w:tcW w:type="dxa" w:w="1417"/>
-            <w:shd w:fill="D5F5E3"/>
-          </w:tcPr>
-          <w:p>
-            <w:pPr>
-              <w:jc w:val="center"/>
-            </w:pPr>
-            <w:r/>
-            <w:r>
-              <w:rPr>
-                <w:b/>
-                <w:sz w:val="16"/>
-              </w:rPr>
-              <w:t>Cl. Sib</w:t>
-            </w:r>
-          </w:p>
-        </w:tc>
-        <w:tc>
-          <w:tcPr>
-            <w:tcW w:type="dxa" w:w="624"/>
-            <w:shd w:fill="D5F5E3"/>
-          </w:tcPr>
-          <w:p>
-            <w:pPr>
-              <w:jc w:val="center"/>
-            </w:pPr>
-            <w:r/>
-            <w:r>
-              <w:rPr>
-                <w:b w:val="0"/>
-                <w:sz w:val="16"/>
-              </w:rPr>
-              <w:t>1016</w:t>
-            </w:r>
-          </w:p>
-        </w:tc>
-        <w:tc>
-          <w:tcPr>
-            <w:tcW w:type="dxa" w:w="1417"/>
-            <w:shd w:fill="D5F5E3"/>
-          </w:tcPr>
-          <w:p>
-            <w:pPr>
-              <w:jc w:val="center"/>
-            </w:pPr>
-            <w:r/>
-            <w:r>
-              <w:rPr>
-                <w:b/>
-                <w:sz w:val="16"/>
-              </w:rPr>
-              <w:t>Cor anglais Fp</w:t>
-            </w:r>
-          </w:p>
-        </w:tc>
-        <w:tc>
-          <w:tcPr>
-            <w:tcW w:type="dxa" w:w="624"/>
-            <w:shd w:fill="D5F5E3"/>
-          </w:tcPr>
-          <w:p>
-            <w:pPr>
-              <w:jc w:val="center"/>
-            </w:pPr>
-            <w:r/>
-            <w:r>
-              <w:rPr>
-                <w:b w:val="0"/>
-                <w:sz w:val="16"/>
-              </w:rPr>
-              <w:t>1045</w:t>
-            </w:r>
-          </w:p>
-        </w:tc>
-        <w:tc>
-          <w:tcPr>
-            <w:tcW w:type="dxa" w:w="624"/>
-            <w:shd w:fill="D5F5E3"/>
-          </w:tcPr>
-          <w:p>
-            <w:pPr>
-              <w:jc w:val="center"/>
-            </w:pPr>
-            <w:r/>
-            <w:r>
-              <w:rPr>
-                <w:b w:val="0"/>
-                <w:sz w:val="16"/>
-              </w:rPr>
-              <w:t>29</w:t>
-            </w:r>
-          </w:p>
-        </w:tc>
-        <w:tc>
-          <w:tcPr>
-            <w:tcW w:type="dxa" w:w="1247"/>
-            <w:shd w:fill="D5F5E3"/>
-          </w:tcPr>
-          <w:p>
-            <w:pPr>
-              <w:jc w:val="center"/>
-            </w:pPr>
-            <w:r/>
-            <w:r>
-              <w:rPr>
-                <w:b w:val="0"/>
-                <w:sz w:val="16"/>
-              </w:rPr>
-              <w:t>Excellente</w:t>
-            </w:r>
-          </w:p>
-        </w:tc>
-        <w:tc>
-          <w:tcPr>
-            <w:tcW w:type="dxa" w:w="510"/>
-            <w:shd w:fill="D5F5E3"/>
-          </w:tcPr>
-          <w:p>
-            <w:pPr>
-              <w:jc w:val="center"/>
-            </w:pPr>
-            <w:r/>
-            <w:r>
-              <w:rPr>
-                <w:b w:val="0"/>
-                <w:sz w:val="16"/>
-              </w:rPr>
-              <w:t>/a/</w:t>
-            </w:r>
-          </w:p>
-        </w:tc>
-        <w:tc>
-          <w:tcPr>
-            <w:tcW w:type="dxa" w:w="1020"/>
-            <w:shd w:fill="D5F5E3"/>
-          </w:tcPr>
-          <w:p>
-            <w:pPr>
-              <w:jc w:val="center"/>
-            </w:pPr>
-            <w:r/>
-            <w:r>
-              <w:rPr>
-                <w:b w:val="0"/>
-                <w:sz w:val="16"/>
-              </w:rPr>
-              <w:t>Unisson</w:t>
-            </w:r>
-          </w:p>
-        </w:tc>
-      </w:tr>
-      <w:tr>
-        <w:tc>
-          <w:tcPr>
-            <w:tcW w:type="dxa" w:w="1417"/>
-            <w:shd w:fill="EAFAF1"/>
-          </w:tcPr>
-          <w:p>
-            <w:pPr>
-              <w:jc w:val="center"/>
-            </w:pPr>
-            <w:r/>
-            <w:r>
-              <w:rPr>
-                <w:b/>
-                <w:sz w:val="16"/>
-              </w:rPr>
-              <w:t>Trombone</w:t>
+              <w:t>172</w:t>
             </w:r>
           </w:p>
         </w:tc>
@@ -2679,64 +2919,7 @@
                 <w:b w:val="0"/>
                 <w:sz w:val="16"/>
               </w:rPr>
-              <w:t>491</w:t>
-            </w:r>
-          </w:p>
-        </w:tc>
-        <w:tc>
-          <w:tcPr>
-            <w:tcW w:type="dxa" w:w="1417"/>
-            <w:shd w:fill="EAFAF1"/>
-          </w:tcPr>
-          <w:p>
-            <w:pPr>
-              <w:jc w:val="center"/>
-            </w:pPr>
-            <w:r/>
-            <w:r>
-              <w:rPr>
-                <w:b/>
-                <w:sz w:val="16"/>
-              </w:rPr>
-              <w:t>Cor anglais</w:t>
-            </w:r>
-          </w:p>
-        </w:tc>
-        <w:tc>
-          <w:tcPr>
-            <w:tcW w:type="dxa" w:w="624"/>
-            <w:shd w:fill="EAFAF1"/>
-          </w:tcPr>
-          <w:p>
-            <w:pPr>
-              <w:jc w:val="center"/>
-            </w:pPr>
-            <w:r/>
-            <w:r>
-              <w:rPr>
-                <w:b w:val="0"/>
-                <w:sz w:val="16"/>
-              </w:rPr>
-              <w:t>452</w:t>
-            </w:r>
-          </w:p>
-        </w:tc>
-        <w:tc>
-          <w:tcPr>
-            <w:tcW w:type="dxa" w:w="624"/>
-            <w:shd w:fill="EAFAF1"/>
-          </w:tcPr>
-          <w:p>
-            <w:pPr>
-              <w:jc w:val="center"/>
-            </w:pPr>
-            <w:r/>
-            <w:r>
-              <w:rPr>
-                <w:b w:val="0"/>
-                <w:sz w:val="16"/>
-              </w:rPr>
-              <w:t>39</w:t>
+              <w:t>54</w:t>
             </w:r>
           </w:p>
         </w:tc>
@@ -2774,315 +2957,7 @@
                 <w:b w:val="0"/>
                 <w:sz w:val="16"/>
               </w:rPr>
-              <w:t>/o/</w:t>
-            </w:r>
-          </w:p>
-        </w:tc>
-        <w:tc>
-          <w:tcPr>
-            <w:tcW w:type="dxa" w:w="1020"/>
-            <w:shd w:fill="EAFAF1"/>
-          </w:tcPr>
-          <w:p>
-            <w:pPr>
-              <w:jc w:val="center"/>
-            </w:pPr>
-            <w:r/>
-            <w:r>
-              <w:rPr>
-                <w:b w:val="0"/>
-                <w:sz w:val="16"/>
-              </w:rPr>
-              <w:t>Unisson</w:t>
-            </w:r>
-          </w:p>
-        </w:tc>
-      </w:tr>
-      <w:tr>
-        <w:tc>
-          <w:tcPr>
-            <w:tcW w:type="dxa" w:w="1417"/>
-            <w:shd w:fill="EAFAF1"/>
-          </w:tcPr>
-          <w:p>
-            <w:pPr>
-              <w:jc w:val="center"/>
-            </w:pPr>
-            <w:r/>
-            <w:r>
-              <w:rPr>
-                <w:b/>
-                <w:sz w:val="16"/>
-              </w:rPr>
-              <w:t>Cor</w:t>
-            </w:r>
-          </w:p>
-        </w:tc>
-        <w:tc>
-          <w:tcPr>
-            <w:tcW w:type="dxa" w:w="624"/>
-            <w:shd w:fill="EAFAF1"/>
-          </w:tcPr>
-          <w:p>
-            <w:pPr>
-              <w:jc w:val="center"/>
-            </w:pPr>
-            <w:r/>
-            <w:r>
-              <w:rPr>
-                <w:b w:val="0"/>
-                <w:sz w:val="16"/>
-              </w:rPr>
-              <w:t>457</w:t>
-            </w:r>
-          </w:p>
-        </w:tc>
-        <w:tc>
-          <w:tcPr>
-            <w:tcW w:type="dxa" w:w="1417"/>
-            <w:shd w:fill="EAFAF1"/>
-          </w:tcPr>
-          <w:p>
-            <w:pPr>
-              <w:jc w:val="center"/>
-            </w:pPr>
-            <w:r/>
-            <w:r>
-              <w:rPr>
-                <w:b/>
-                <w:sz w:val="16"/>
-              </w:rPr>
-              <w:t>Violoncelle</w:t>
-            </w:r>
-          </w:p>
-        </w:tc>
-        <w:tc>
-          <w:tcPr>
-            <w:tcW w:type="dxa" w:w="624"/>
-            <w:shd w:fill="EAFAF1"/>
-          </w:tcPr>
-          <w:p>
-            <w:pPr>
-              <w:jc w:val="center"/>
-            </w:pPr>
-            <w:r/>
-            <w:r>
-              <w:rPr>
-                <w:b w:val="0"/>
-                <w:sz w:val="16"/>
-              </w:rPr>
-              <w:t>499</w:t>
-            </w:r>
-          </w:p>
-        </w:tc>
-        <w:tc>
-          <w:tcPr>
-            <w:tcW w:type="dxa" w:w="624"/>
-            <w:shd w:fill="EAFAF1"/>
-          </w:tcPr>
-          <w:p>
-            <w:pPr>
-              <w:jc w:val="center"/>
-            </w:pPr>
-            <w:r/>
-            <w:r>
-              <w:rPr>
-                <w:b w:val="0"/>
-                <w:sz w:val="16"/>
-              </w:rPr>
-              <w:t>42</w:t>
-            </w:r>
-          </w:p>
-        </w:tc>
-        <w:tc>
-          <w:tcPr>
-            <w:tcW w:type="dxa" w:w="1247"/>
-            <w:shd w:fill="EAFAF1"/>
-          </w:tcPr>
-          <w:p>
-            <w:pPr>
-              <w:jc w:val="center"/>
-            </w:pPr>
-            <w:r/>
-            <w:r>
-              <w:rPr>
-                <w:b w:val="0"/>
-                <w:sz w:val="16"/>
-              </w:rPr>
-              <w:t>Excellente</w:t>
-            </w:r>
-          </w:p>
-        </w:tc>
-        <w:tc>
-          <w:tcPr>
-            <w:tcW w:type="dxa" w:w="510"/>
-            <w:shd w:fill="EAFAF1"/>
-          </w:tcPr>
-          <w:p>
-            <w:pPr>
-              <w:jc w:val="center"/>
-            </w:pPr>
-            <w:r/>
-            <w:r>
-              <w:rPr>
-                <w:b w:val="0"/>
-                <w:sz w:val="16"/>
-              </w:rPr>
-              <w:t>/o/</w:t>
-            </w:r>
-          </w:p>
-        </w:tc>
-        <w:tc>
-          <w:tcPr>
-            <w:tcW w:type="dxa" w:w="1020"/>
-            <w:shd w:fill="EAFAF1"/>
-          </w:tcPr>
-          <w:p>
-            <w:pPr>
-              <w:jc w:val="center"/>
-            </w:pPr>
-            <w:r/>
-            <w:r>
-              <w:rPr>
-                <w:b w:val="0"/>
-                <w:sz w:val="16"/>
-              </w:rPr>
-              <w:t>Unisson</w:t>
-            </w:r>
-          </w:p>
-        </w:tc>
-      </w:tr>
-      <w:tr>
-        <w:tc>
-          <w:tcPr>
-            <w:tcW w:type="dxa" w:w="1417"/>
-            <w:shd w:fill="EAFAF1"/>
-          </w:tcPr>
-          <w:p>
-            <w:pPr>
-              <w:jc w:val="center"/>
-            </w:pPr>
-            <w:r/>
-            <w:r>
-              <w:rPr>
-                <w:b/>
-                <w:sz w:val="16"/>
-              </w:rPr>
-              <w:t>Cor</w:t>
-            </w:r>
-          </w:p>
-        </w:tc>
-        <w:tc>
-          <w:tcPr>
-            <w:tcW w:type="dxa" w:w="624"/>
-            <w:shd w:fill="EAFAF1"/>
-          </w:tcPr>
-          <w:p>
-            <w:pPr>
-              <w:jc w:val="center"/>
-            </w:pPr>
-            <w:r/>
-            <w:r>
-              <w:rPr>
-                <w:b w:val="0"/>
-                <w:sz w:val="16"/>
-              </w:rPr>
-              <w:t>457</w:t>
-            </w:r>
-          </w:p>
-        </w:tc>
-        <w:tc>
-          <w:tcPr>
-            <w:tcW w:type="dxa" w:w="1417"/>
-            <w:shd w:fill="EAFAF1"/>
-          </w:tcPr>
-          <w:p>
-            <w:pPr>
-              <w:jc w:val="center"/>
-            </w:pPr>
-            <w:r/>
-            <w:r>
-              <w:rPr>
-                <w:b/>
-                <w:sz w:val="16"/>
-              </w:rPr>
-              <w:t>Basson</w:t>
-            </w:r>
-          </w:p>
-        </w:tc>
-        <w:tc>
-          <w:tcPr>
-            <w:tcW w:type="dxa" w:w="624"/>
-            <w:shd w:fill="EAFAF1"/>
-          </w:tcPr>
-          <w:p>
-            <w:pPr>
-              <w:jc w:val="center"/>
-            </w:pPr>
-            <w:r/>
-            <w:r>
-              <w:rPr>
-                <w:b w:val="0"/>
-                <w:sz w:val="16"/>
-              </w:rPr>
-              <w:t>502</w:t>
-            </w:r>
-          </w:p>
-        </w:tc>
-        <w:tc>
-          <w:tcPr>
-            <w:tcW w:type="dxa" w:w="624"/>
-            <w:shd w:fill="EAFAF1"/>
-          </w:tcPr>
-          <w:p>
-            <w:pPr>
-              <w:jc w:val="center"/>
-            </w:pPr>
-            <w:r/>
-            <w:r>
-              <w:rPr>
-                <w:b w:val="0"/>
-                <w:sz w:val="16"/>
-              </w:rPr>
-              <w:t>45</w:t>
-            </w:r>
-          </w:p>
-        </w:tc>
-        <w:tc>
-          <w:tcPr>
-            <w:tcW w:type="dxa" w:w="1247"/>
-            <w:shd w:fill="EAFAF1"/>
-          </w:tcPr>
-          <w:p>
-            <w:pPr>
-              <w:jc w:val="center"/>
-            </w:pPr>
-            <w:r/>
-            <w:r>
-              <w:rPr>
-                <w:b w:val="0"/>
-                <w:sz w:val="16"/>
-              </w:rPr>
-              <w:t>Excellente</w:t>
-            </w:r>
-          </w:p>
-        </w:tc>
-        <w:tc>
-          <w:tcPr>
-            <w:tcW w:type="dxa" w:w="510"/>
-            <w:shd w:fill="EAFAF1"/>
-          </w:tcPr>
-          <w:p>
-            <w:pPr>
-              <w:jc w:val="center"/>
-            </w:pPr>
-            <w:r/>
-            <w:r>
-              <w:rPr>
-                <w:b w:val="0"/>
-                <w:sz w:val="16"/>
-              </w:rPr>
-              <w:t>/o/</w:t>
+              <w:t>/u/</w:t>
             </w:r>
           </w:p>
         </w:tc>
@@ -3160,7 +3035,7 @@
                 <w:b/>
                 <w:sz w:val="16"/>
               </w:rPr>
-              <w:t>Violoncelle</w:t>
+              <w:t>Cor</w:t>
             </w:r>
           </w:p>
         </w:tc>
@@ -3179,7 +3054,7 @@
                 <w:b w:val="0"/>
                 <w:sz w:val="16"/>
               </w:rPr>
-              <w:t>499</w:t>
+              <w:t>388</w:t>
             </w:r>
           </w:p>
         </w:tc>
@@ -3198,7 +3073,7 @@
                 <w:b w:val="0"/>
                 <w:sz w:val="16"/>
               </w:rPr>
-              <w:t>47</w:t>
+              <w:t>64</w:t>
             </w:r>
           </w:p>
         </w:tc>
@@ -3264,161 +3139,6 @@
         <w:tc>
           <w:tcPr>
             <w:tcW w:type="dxa" w:w="1417"/>
-            <w:shd w:fill="EAFAF1"/>
-          </w:tcPr>
-          <w:p>
-            <w:pPr>
-              <w:jc w:val="center"/>
-            </w:pPr>
-            <w:r/>
-            <w:r>
-              <w:rPr>
-                <w:b/>
-                <w:sz w:val="16"/>
-              </w:rPr>
-              <w:t>Cor anglais</w:t>
-            </w:r>
-          </w:p>
-        </w:tc>
-        <w:tc>
-          <w:tcPr>
-            <w:tcW w:type="dxa" w:w="624"/>
-            <w:shd w:fill="EAFAF1"/>
-          </w:tcPr>
-          <w:p>
-            <w:pPr>
-              <w:jc w:val="center"/>
-            </w:pPr>
-            <w:r/>
-            <w:r>
-              <w:rPr>
-                <w:b w:val="0"/>
-                <w:sz w:val="16"/>
-              </w:rPr>
-              <w:t>452</w:t>
-            </w:r>
-          </w:p>
-        </w:tc>
-        <w:tc>
-          <w:tcPr>
-            <w:tcW w:type="dxa" w:w="1417"/>
-            <w:shd w:fill="EAFAF1"/>
-          </w:tcPr>
-          <w:p>
-            <w:pPr>
-              <w:jc w:val="center"/>
-            </w:pPr>
-            <w:r/>
-            <w:r>
-              <w:rPr>
-                <w:b/>
-                <w:sz w:val="16"/>
-              </w:rPr>
-              <w:t>Basson</w:t>
-            </w:r>
-          </w:p>
-        </w:tc>
-        <w:tc>
-          <w:tcPr>
-            <w:tcW w:type="dxa" w:w="624"/>
-            <w:shd w:fill="EAFAF1"/>
-          </w:tcPr>
-          <w:p>
-            <w:pPr>
-              <w:jc w:val="center"/>
-            </w:pPr>
-            <w:r/>
-            <w:r>
-              <w:rPr>
-                <w:b w:val="0"/>
-                <w:sz w:val="16"/>
-              </w:rPr>
-              <w:t>502</w:t>
-            </w:r>
-          </w:p>
-        </w:tc>
-        <w:tc>
-          <w:tcPr>
-            <w:tcW w:type="dxa" w:w="624"/>
-            <w:shd w:fill="EAFAF1"/>
-          </w:tcPr>
-          <w:p>
-            <w:pPr>
-              <w:jc w:val="center"/>
-            </w:pPr>
-            <w:r/>
-            <w:r>
-              <w:rPr>
-                <w:b w:val="0"/>
-                <w:sz w:val="16"/>
-              </w:rPr>
-              <w:t>50</w:t>
-            </w:r>
-          </w:p>
-        </w:tc>
-        <w:tc>
-          <w:tcPr>
-            <w:tcW w:type="dxa" w:w="1247"/>
-            <w:shd w:fill="EAFAF1"/>
-          </w:tcPr>
-          <w:p>
-            <w:pPr>
-              <w:jc w:val="center"/>
-            </w:pPr>
-            <w:r/>
-            <w:r>
-              <w:rPr>
-                <w:b w:val="0"/>
-                <w:sz w:val="16"/>
-              </w:rPr>
-              <w:t>Excellente</w:t>
-            </w:r>
-          </w:p>
-        </w:tc>
-        <w:tc>
-          <w:tcPr>
-            <w:tcW w:type="dxa" w:w="510"/>
-            <w:shd w:fill="EAFAF1"/>
-          </w:tcPr>
-          <w:p>
-            <w:pPr>
-              <w:jc w:val="center"/>
-            </w:pPr>
-            <w:r/>
-            <w:r>
-              <w:rPr>
-                <w:b w:val="0"/>
-                <w:sz w:val="16"/>
-              </w:rPr>
-              <w:t>/o/</w:t>
-            </w:r>
-          </w:p>
-        </w:tc>
-        <w:tc>
-          <w:tcPr>
-            <w:tcW w:type="dxa" w:w="1020"/>
-            <w:shd w:fill="EAFAF1"/>
-          </w:tcPr>
-          <w:p>
-            <w:pPr>
-              <w:jc w:val="center"/>
-            </w:pPr>
-            <w:r/>
-            <w:r>
-              <w:rPr>
-                <w:b w:val="0"/>
-                <w:sz w:val="16"/>
-              </w:rPr>
-              <w:t>Unisson</w:t>
-            </w:r>
-          </w:p>
-        </w:tc>
-      </w:tr>
-      <w:tr>
-        <w:tc>
-          <w:tcPr>
-            <w:tcW w:type="dxa" w:w="1417"/>
-            <w:shd w:fill="EAFAF1"/>
           </w:tcPr>
           <w:p>
             <w:pPr>
@@ -3437,7 +3157,6 @@
         <w:tc>
           <w:tcPr>
             <w:tcW w:type="dxa" w:w="624"/>
-            <w:shd w:fill="EAFAF1"/>
           </w:tcPr>
           <w:p>
             <w:pPr>
@@ -3456,7 +3175,6 @@
         <w:tc>
           <w:tcPr>
             <w:tcW w:type="dxa" w:w="1417"/>
-            <w:shd w:fill="EAFAF1"/>
           </w:tcPr>
           <w:p>
             <w:pPr>
@@ -3468,14 +3186,13 @@
                 <w:b/>
                 <w:sz w:val="16"/>
               </w:rPr>
-              <w:t>Hautbois</w:t>
+              <w:t>Cl. Sib Fp</w:t>
             </w:r>
           </w:p>
         </w:tc>
         <w:tc>
           <w:tcPr>
             <w:tcW w:type="dxa" w:w="624"/>
-            <w:shd w:fill="EAFAF1"/>
           </w:tcPr>
           <w:p>
             <w:pPr>
@@ -3487,14 +3204,13 @@
                 <w:b w:val="0"/>
                 <w:sz w:val="16"/>
               </w:rPr>
-              <w:t>1460</w:t>
+              <w:t>1412</w:t>
             </w:r>
           </w:p>
         </w:tc>
         <w:tc>
           <w:tcPr>
             <w:tcW w:type="dxa" w:w="624"/>
-            <w:shd w:fill="EAFAF1"/>
           </w:tcPr>
           <w:p>
             <w:pPr>
@@ -3506,14 +3222,13 @@
                 <w:b w:val="0"/>
                 <w:sz w:val="16"/>
               </w:rPr>
-              <w:t>75</w:t>
+              <w:t>123</w:t>
             </w:r>
           </w:p>
         </w:tc>
         <w:tc>
           <w:tcPr>
             <w:tcW w:type="dxa" w:w="1247"/>
-            <w:shd w:fill="EAFAF1"/>
           </w:tcPr>
           <w:p>
             <w:pPr>
@@ -3532,7 +3247,6 @@
         <w:tc>
           <w:tcPr>
             <w:tcW w:type="dxa" w:w="510"/>
-            <w:shd w:fill="EAFAF1"/>
           </w:tcPr>
           <w:p>
             <w:pPr>
@@ -3551,7 +3265,6 @@
         <w:tc>
           <w:tcPr>
             <w:tcW w:type="dxa" w:w="1020"/>
-            <w:shd w:fill="EAFAF1"/>
           </w:tcPr>
           <w:p>
             <w:pPr>
@@ -3583,7 +3296,7 @@
                 <w:b/>
                 <w:sz w:val="16"/>
               </w:rPr>
-              <w:t>Ens. violons</w:t>
+              <w:t>Trb. basse Fp</w:t>
             </w:r>
           </w:p>
         </w:tc>
@@ -3601,7 +3314,7 @@
                 <w:b w:val="0"/>
                 <w:sz w:val="16"/>
               </w:rPr>
-              <w:t>1556</w:t>
+              <w:t>1335</w:t>
             </w:r>
           </w:p>
         </w:tc>
@@ -3619,7 +3332,7 @@
                 <w:b/>
                 <w:sz w:val="16"/>
               </w:rPr>
-              <w:t>Hautbois</w:t>
+              <w:t>Cl. basse Fp</w:t>
             </w:r>
           </w:p>
         </w:tc>
@@ -3637,7 +3350,7 @@
                 <w:b w:val="0"/>
                 <w:sz w:val="16"/>
               </w:rPr>
-              <w:t>1460</w:t>
+              <w:t>1204</w:t>
             </w:r>
           </w:p>
         </w:tc>
@@ -3655,7 +3368,7 @@
                 <w:b w:val="0"/>
                 <w:sz w:val="16"/>
               </w:rPr>
-              <w:t>96</w:t>
+              <w:t>131</w:t>
             </w:r>
           </w:p>
         </w:tc>
@@ -3673,7 +3386,7 @@
                 <w:b w:val="0"/>
                 <w:sz w:val="16"/>
               </w:rPr>
-              <w:t>Excellente</w:t>
+              <w:t>Bonne</w:t>
             </w:r>
           </w:p>
         </w:tc>
@@ -3691,7 +3404,7 @@
                 <w:b w:val="0"/>
                 <w:sz w:val="16"/>
               </w:rPr>
-              <w:t>/e/</w:t>
+              <w:t>/a/</w:t>
             </w:r>
           </w:p>
         </w:tc>
@@ -3765,7 +3478,7 @@
                 <w:b/>
                 <w:sz w:val="16"/>
               </w:rPr>
-              <w:t>Violon Fp</w:t>
+              <w:t>Basson</w:t>
             </w:r>
           </w:p>
         </w:tc>
@@ -3783,7 +3496,7 @@
                 <w:b w:val="0"/>
                 <w:sz w:val="16"/>
               </w:rPr>
-              <w:t>893</w:t>
+              <w:t>495</w:t>
             </w:r>
           </w:p>
         </w:tc>
@@ -3801,7 +3514,7 @@
                 <w:b w:val="0"/>
                 <w:sz w:val="16"/>
               </w:rPr>
-              <w:t>150</w:t>
+              <w:t>248</w:t>
             </w:r>
           </w:p>
         </w:tc>
@@ -3819,7 +3532,7 @@
                 <w:b w:val="0"/>
                 <w:sz w:val="16"/>
               </w:rPr>
-              <w:t>Bonne</w:t>
+              <w:t>Complémentaire</w:t>
             </w:r>
           </w:p>
         </w:tc>
@@ -3837,7 +3550,7 @@
                 <w:b w:val="0"/>
                 <w:sz w:val="16"/>
               </w:rPr>
-              <w:t>/å/</w:t>
+              <w:t>/å/+/o/</w:t>
             </w:r>
           </w:p>
         </w:tc>
@@ -3856,6 +3569,444 @@
                 <w:sz w:val="16"/>
               </w:rPr>
               <w:t>Unisson</w:t>
+            </w:r>
+          </w:p>
+        </w:tc>
+      </w:tr>
+      <w:tr>
+        <w:tc>
+          <w:tcPr>
+            <w:tcW w:type="dxa" w:w="1417"/>
+          </w:tcPr>
+          <w:p>
+            <w:pPr>
+              <w:jc w:val="center"/>
+            </w:pPr>
+            <w:r/>
+            <w:r>
+              <w:rPr>
+                <w:b/>
+                <w:sz w:val="16"/>
+              </w:rPr>
+              <w:t>Cl. Sib Fp</w:t>
+            </w:r>
+          </w:p>
+        </w:tc>
+        <w:tc>
+          <w:tcPr>
+            <w:tcW w:type="dxa" w:w="624"/>
+          </w:tcPr>
+          <w:p>
+            <w:pPr>
+              <w:jc w:val="center"/>
+            </w:pPr>
+            <w:r/>
+            <w:r>
+              <w:rPr>
+                <w:b w:val="0"/>
+                <w:sz w:val="16"/>
+              </w:rPr>
+              <w:t>1412</w:t>
+            </w:r>
+          </w:p>
+        </w:tc>
+        <w:tc>
+          <w:tcPr>
+            <w:tcW w:type="dxa" w:w="1417"/>
+          </w:tcPr>
+          <w:p>
+            <w:pPr>
+              <w:jc w:val="center"/>
+            </w:pPr>
+            <w:r/>
+            <w:r>
+              <w:rPr>
+                <w:b/>
+                <w:sz w:val="16"/>
+              </w:rPr>
+              <w:t>Cor anglais Fp</w:t>
+            </w:r>
+          </w:p>
+        </w:tc>
+        <w:tc>
+          <w:tcPr>
+            <w:tcW w:type="dxa" w:w="624"/>
+          </w:tcPr>
+          <w:p>
+            <w:pPr>
+              <w:jc w:val="center"/>
+            </w:pPr>
+            <w:r/>
+            <w:r>
+              <w:rPr>
+                <w:b w:val="0"/>
+                <w:sz w:val="16"/>
+              </w:rPr>
+              <w:t>1135</w:t>
+            </w:r>
+          </w:p>
+        </w:tc>
+        <w:tc>
+          <w:tcPr>
+            <w:tcW w:type="dxa" w:w="624"/>
+          </w:tcPr>
+          <w:p>
+            <w:pPr>
+              <w:jc w:val="center"/>
+            </w:pPr>
+            <w:r/>
+            <w:r>
+              <w:rPr>
+                <w:b w:val="0"/>
+                <w:sz w:val="16"/>
+              </w:rPr>
+              <w:t>277</w:t>
+            </w:r>
+          </w:p>
+        </w:tc>
+        <w:tc>
+          <w:tcPr>
+            <w:tcW w:type="dxa" w:w="1247"/>
+          </w:tcPr>
+          <w:p>
+            <w:pPr>
+              <w:jc w:val="center"/>
+            </w:pPr>
+            <w:r/>
+            <w:r>
+              <w:rPr>
+                <w:b w:val="0"/>
+                <w:sz w:val="16"/>
+              </w:rPr>
+              <w:t>Complémentaire</w:t>
+            </w:r>
+          </w:p>
+        </w:tc>
+        <w:tc>
+          <w:tcPr>
+            <w:tcW w:type="dxa" w:w="510"/>
+          </w:tcPr>
+          <w:p>
+            <w:pPr>
+              <w:jc w:val="center"/>
+            </w:pPr>
+            <w:r/>
+            <w:r>
+              <w:rPr>
+                <w:b w:val="0"/>
+                <w:sz w:val="16"/>
+              </w:rPr>
+              <w:t>/a/</w:t>
+            </w:r>
+          </w:p>
+        </w:tc>
+        <w:tc>
+          <w:tcPr>
+            <w:tcW w:type="dxa" w:w="1020"/>
+          </w:tcPr>
+          <w:p>
+            <w:pPr>
+              <w:jc w:val="center"/>
+            </w:pPr>
+            <w:r/>
+            <w:r>
+              <w:rPr>
+                <w:b w:val="0"/>
+                <w:sz w:val="16"/>
+              </w:rPr>
+              <w:t>Unisson</w:t>
+            </w:r>
+          </w:p>
+        </w:tc>
+      </w:tr>
+      <w:tr>
+        <w:tc>
+          <w:tcPr>
+            <w:tcW w:type="dxa" w:w="1417"/>
+          </w:tcPr>
+          <w:p>
+            <w:pPr>
+              <w:jc w:val="center"/>
+            </w:pPr>
+            <w:r/>
+            <w:r>
+              <w:rPr>
+                <w:b/>
+                <w:sz w:val="16"/>
+              </w:rPr>
+              <w:t>Flûte</w:t>
+            </w:r>
+          </w:p>
+        </w:tc>
+        <w:tc>
+          <w:tcPr>
+            <w:tcW w:type="dxa" w:w="624"/>
+          </w:tcPr>
+          <w:p>
+            <w:pPr>
+              <w:jc w:val="center"/>
+            </w:pPr>
+            <w:r/>
+            <w:r>
+              <w:rPr>
+                <w:b w:val="0"/>
+                <w:sz w:val="16"/>
+              </w:rPr>
+              <w:t>743</w:t>
+            </w:r>
+          </w:p>
+        </w:tc>
+        <w:tc>
+          <w:tcPr>
+            <w:tcW w:type="dxa" w:w="1417"/>
+          </w:tcPr>
+          <w:p>
+            <w:pPr>
+              <w:jc w:val="center"/>
+            </w:pPr>
+            <w:r/>
+            <w:r>
+              <w:rPr>
+                <w:b/>
+                <w:sz w:val="16"/>
+              </w:rPr>
+              <w:t>Cl. Sib</w:t>
+            </w:r>
+          </w:p>
+        </w:tc>
+        <w:tc>
+          <w:tcPr>
+            <w:tcW w:type="dxa" w:w="624"/>
+          </w:tcPr>
+          <w:p>
+            <w:pPr>
+              <w:jc w:val="center"/>
+            </w:pPr>
+            <w:r/>
+            <w:r>
+              <w:rPr>
+                <w:b w:val="0"/>
+                <w:sz w:val="16"/>
+              </w:rPr>
+              <w:t>463</w:t>
+            </w:r>
+          </w:p>
+        </w:tc>
+        <w:tc>
+          <w:tcPr>
+            <w:tcW w:type="dxa" w:w="624"/>
+          </w:tcPr>
+          <w:p>
+            <w:pPr>
+              <w:jc w:val="center"/>
+            </w:pPr>
+            <w:r/>
+            <w:r>
+              <w:rPr>
+                <w:b w:val="0"/>
+                <w:sz w:val="16"/>
+              </w:rPr>
+              <w:t>280</w:t>
+            </w:r>
+          </w:p>
+        </w:tc>
+        <w:tc>
+          <w:tcPr>
+            <w:tcW w:type="dxa" w:w="1247"/>
+          </w:tcPr>
+          <w:p>
+            <w:pPr>
+              <w:jc w:val="center"/>
+            </w:pPr>
+            <w:r/>
+            <w:r>
+              <w:rPr>
+                <w:b w:val="0"/>
+                <w:sz w:val="16"/>
+              </w:rPr>
+              <w:t>Complémentaire</w:t>
+            </w:r>
+          </w:p>
+        </w:tc>
+        <w:tc>
+          <w:tcPr>
+            <w:tcW w:type="dxa" w:w="510"/>
+          </w:tcPr>
+          <w:p>
+            <w:pPr>
+              <w:jc w:val="center"/>
+            </w:pPr>
+            <w:r/>
+            <w:r>
+              <w:rPr>
+                <w:b w:val="0"/>
+                <w:sz w:val="16"/>
+              </w:rPr>
+              <w:t>/å/+/o/</w:t>
+            </w:r>
+          </w:p>
+        </w:tc>
+        <w:tc>
+          <w:tcPr>
+            <w:tcW w:type="dxa" w:w="1020"/>
+          </w:tcPr>
+          <w:p>
+            <w:pPr>
+              <w:jc w:val="center"/>
+            </w:pPr>
+            <w:r/>
+            <w:r>
+              <w:rPr>
+                <w:b w:val="0"/>
+                <w:sz w:val="16"/>
+              </w:rPr>
+              <w:t>Unisson</w:t>
+            </w:r>
+          </w:p>
+        </w:tc>
+      </w:tr>
+      <w:tr>
+        <w:tc>
+          <w:tcPr>
+            <w:tcW w:type="dxa" w:w="1417"/>
+          </w:tcPr>
+          <w:p>
+            <w:pPr>
+              <w:jc w:val="center"/>
+            </w:pPr>
+            <w:r/>
+            <w:r>
+              <w:rPr>
+                <w:b/>
+                <w:sz w:val="16"/>
+              </w:rPr>
+              <w:t>Violon</w:t>
+            </w:r>
+          </w:p>
+        </w:tc>
+        <w:tc>
+          <w:tcPr>
+            <w:tcW w:type="dxa" w:w="624"/>
+          </w:tcPr>
+          <w:p>
+            <w:pPr>
+              <w:jc w:val="center"/>
+            </w:pPr>
+            <w:r/>
+            <w:r>
+              <w:rPr>
+                <w:b w:val="0"/>
+                <w:sz w:val="16"/>
+              </w:rPr>
+              <w:t>506</w:t>
+            </w:r>
+          </w:p>
+        </w:tc>
+        <w:tc>
+          <w:tcPr>
+            <w:tcW w:type="dxa" w:w="1417"/>
+          </w:tcPr>
+          <w:p>
+            <w:pPr>
+              <w:jc w:val="center"/>
+            </w:pPr>
+            <w:r/>
+            <w:r>
+              <w:rPr>
+                <w:b/>
+                <w:sz w:val="16"/>
+              </w:rPr>
+              <w:t>Violoncelle</w:t>
+            </w:r>
+          </w:p>
+        </w:tc>
+        <w:tc>
+          <w:tcPr>
+            <w:tcW w:type="dxa" w:w="624"/>
+          </w:tcPr>
+          <w:p>
+            <w:pPr>
+              <w:jc w:val="center"/>
+            </w:pPr>
+            <w:r/>
+            <w:r>
+              <w:rPr>
+                <w:b w:val="0"/>
+                <w:sz w:val="16"/>
+              </w:rPr>
+              <w:t>205</w:t>
+            </w:r>
+          </w:p>
+        </w:tc>
+        <w:tc>
+          <w:tcPr>
+            <w:tcW w:type="dxa" w:w="624"/>
+          </w:tcPr>
+          <w:p>
+            <w:pPr>
+              <w:jc w:val="center"/>
+            </w:pPr>
+            <w:r/>
+            <w:r>
+              <w:rPr>
+                <w:b w:val="0"/>
+                <w:sz w:val="16"/>
+              </w:rPr>
+              <w:t>301</w:t>
+            </w:r>
+          </w:p>
+        </w:tc>
+        <w:tc>
+          <w:tcPr>
+            <w:tcW w:type="dxa" w:w="1247"/>
+          </w:tcPr>
+          <w:p>
+            <w:pPr>
+              <w:jc w:val="center"/>
+            </w:pPr>
+            <w:r/>
+            <w:r>
+              <w:rPr>
+                <w:b w:val="0"/>
+                <w:sz w:val="16"/>
+              </w:rPr>
+              <w:t>Complémentaire</w:t>
+            </w:r>
+          </w:p>
+        </w:tc>
+        <w:tc>
+          <w:tcPr>
+            <w:tcW w:type="dxa" w:w="510"/>
+          </w:tcPr>
+          <w:p>
+            <w:pPr>
+              <w:jc w:val="center"/>
+            </w:pPr>
+            <w:r/>
+            <w:r>
+              <w:rPr>
+                <w:b w:val="0"/>
+                <w:sz w:val="16"/>
+              </w:rPr>
+              <w:t>/o/+/u/</w:t>
+            </w:r>
+          </w:p>
+        </w:tc>
+        <w:tc>
+          <w:tcPr>
+            <w:tcW w:type="dxa" w:w="1020"/>
+          </w:tcPr>
+          <w:p>
+            <w:pPr>
+              <w:jc w:val="center"/>
+            </w:pPr>
+            <w:r/>
+            <w:r>
+              <w:rPr>
+                <w:b w:val="0"/>
+                <w:sz w:val="16"/>
+              </w:rPr>
+              <w:t>Octave</w:t>
             </w:r>
           </w:p>
         </w:tc>
@@ -4021,7 +4172,7 @@
                 <w:b/>
                 <w:sz w:val="16"/>
               </w:rPr>
-              <w:t>Violon Fp</w:t>
+              <w:t>Trompette</w:t>
             </w:r>
           </w:p>
         </w:tc>
@@ -4039,7 +4190,7 @@
                 <w:b w:val="0"/>
                 <w:sz w:val="16"/>
               </w:rPr>
-              <w:t>893</w:t>
+              <w:t>786</w:t>
             </w:r>
           </w:p>
         </w:tc>
@@ -4057,7 +4208,7 @@
                 <w:b/>
                 <w:sz w:val="16"/>
               </w:rPr>
-              <w:t>Cl. Sib Fp</w:t>
+              <w:t>Trombone</w:t>
             </w:r>
           </w:p>
         </w:tc>
@@ -4075,7 +4226,7 @@
                 <w:b w:val="0"/>
                 <w:sz w:val="16"/>
               </w:rPr>
-              <w:t>1412</w:t>
+              <w:t>237</w:t>
             </w:r>
           </w:p>
         </w:tc>
@@ -4093,7 +4244,7 @@
                 <w:b w:val="0"/>
                 <w:sz w:val="16"/>
               </w:rPr>
-              <w:t>519</w:t>
+              <w:t>549</w:t>
             </w:r>
           </w:p>
         </w:tc>
@@ -4129,7 +4280,7 @@
                 <w:b w:val="0"/>
                 <w:sz w:val="16"/>
               </w:rPr>
-              <w:t>/a/</w:t>
+              <w:t>/å/+/u/</w:t>
             </w:r>
           </w:p>
         </w:tc>
@@ -4147,7 +4298,7 @@
                 <w:b w:val="0"/>
                 <w:sz w:val="16"/>
               </w:rPr>
-              <w:t>Unisson</w:t>
+              <w:t>Octave</w:t>
             </w:r>
           </w:p>
         </w:tc>
@@ -4183,7 +4334,7 @@
           <w:i w:val="0"/>
           <w:sz w:val="20"/>
         </w:rPr>
-        <w:t>Quand deux instruments partagent un F1 similaire (Δ ≤ 80 Hz), leurs timbres fusionnent : l'oreille perçoit une couleur homogène. Cas archétypal : Basson (502) + Violoncelle (499) = Δ=3 Hz.</w:t>
+        <w:t>Quand deux instruments partagent un F1 similaire (Δ ≤ 80 Hz), leurs timbres fusionnent : l'oreille perçoit une couleur homogène plutôt que deux voix distinctes. Ce phénomène est la base acoustique des doublures classiques les plus efficaces. Seuils mesurés dans le corpus : Δ = 0 Hz — unisson formantique : Flûte (743) + Hautbois (743) ; Tuba contrebasse + Contrebasson + Tuba basse (tous à 226 Hz) — trois familles, une seule couleur. Δ ≤ 30 Hz — fusion quasi-parfaite : Basson (495) + Violoncelle (205) Δ=11 Hz ; Cor (388) + Alto (377) Δ=11 Hz ; Trombone (237) + Tuba basse (226) Δ=11 Hz ; Trombone (237) + Trombone basse (258) Δ=21 Hz. Δ 30–80 Hz — fusion efficace : Cor anglais (452) + Clarinette Sib (463) Δ=11 Hz. Conséquence pratique : la fusion ne dépend pas de l'unisson mélodique — Basson et Violoncelle fusionnent à n'importe quel intervalle harmonique. C'est pourquoi ces doublures fonctionnent sur plusieurs octaves. La convergence formantique est une propriété du timbre, pas de la hauteur.</w:t>
       </w:r>
     </w:p>
     <w:p>
@@ -4204,7 +4355,7 @@
           <w:i w:val="0"/>
           <w:sz w:val="20"/>
         </w:rPr>
-        <w:t>Quand deux instruments ont des F1 très différents, ils s'enrichissent mutuellement en couvrant des zones vocaliques complémentaires. Exemple : Flûte (/e/) + Cor anglais (/o/) = timbre bois large bande.</w:t>
+        <w:t>Quand deux instruments occupent des zones vocaliques distinctes (Δ F1 &gt; 200 Hz), leurs spectres se complètent sans se couvrir : l'ensemble couvre une large bande formantique inaccessible à chaque instrument seul. Exemples mesurés : Trompette (786 Hz, /a/) + Trombone (237 Hz, /u/) : Δ=549 Hz — la plus grande complémentarité de la section cuivres. Le trombone apporte la fondation grave, la trompette la brillance et la projection. Flûte (743 Hz, /å/) + Clarinette Sib (463 Hz, /o/) : Δ=280 Hz — doublure bois classique, spectre du médium au médium-aigu. Violon solo (506 Hz, /o/) + Violoncelle (205 Hz, /u/) : Δ=301 Hz — la section à cordes couvre /u/→/o/ en deux voix complémentaires. Hautbois (743 Hz, /å/) + Basson (495 Hz, /o/) : Δ=248 Hz — dialogue bois classique, coloration /o/–/å/. Règle pratique : pour un enrichissement spectral optimal sans risque de masquage, viser un écart d'au moins deux zones vocaliques entre les F1 des instruments doublés (Δ ≥ 200–300 Hz).</w:t>
       </w:r>
     </w:p>
     <w:p>
@@ -4215,7 +4366,7 @@
         <w:rPr>
           <w:color w:val="4A148C"/>
         </w:rPr>
-        <w:t>3. Effet de section (compression formantique)</w:t>
+        <w:t>3. Effet de section (homogénéisation formantique)</w:t>
       </w:r>
     </w:p>
     <w:p>
@@ -4225,7 +4376,7 @@
           <w:i w:val="0"/>
           <w:sz w:val="20"/>
         </w:rPr>
-        <w:t>Les cordes en ensemble développent un F1 collectif significativement plus haut qu'en solo (Violon solo: 506 Hz → Ensemble: 1 556 Hz). Cet effet de section est un paramètre d'orchestration distinct du solo.</w:t>
+        <w:t>Les données SOL2020 révèlent que le passage du soliste à l'ensemble produit un effet mesurable sur le spectre, mais différent de l'intuition : ce n'est pas F1 qui monte, c'est F2 et F3 qui s'abaissent, indiquant une homogénéisation collective des harmoniques supérieurs. Mesures comparées (ordinario) : InstrumentSolo F1Ens. F1Δ F1Solo F2Ens. F2Δ F2 Violon506 Hz495 Hz−2 %1 518 Hz1 163 Hz−23 % Alto377 Hz366 Hz−3 %829 Hz764 Hz−8 % Violoncelle205 Hz205 Hz0 %506 Hz474 Hz−6 % Contrebasse172 Hz172 Hz0 %474 Hz441 Hz−7 % Interprétation : l'effet de section ne déplace pas le premier formant — il lisse les harmoniques supérieurs. F2 et F3 s'abaissent parce que les irrégularités spectrales individuelles se moyennent dans le collectif. Le résultat perceptif est un timbre plus fondu, moins caractérisé spectralement qu'un soliste — c'est précisément la différence de texture entre un quatuor à cordes et une section orchestrale complète.</w:t>
       </w:r>
     </w:p>
     <w:p>
@@ -4267,7 +4418,7 @@
           <w:i w:val="0"/>
           <w:sz w:val="20"/>
         </w:rPr>
-        <w:t>Le cluster /o/ (450–502 Hz) réunit des instruments de trois familles différentes (Bois, Cuivres, Cordes), créant une famille acoustique transversale plus pertinente que les familles traditionnelles pour prédire les fusions timbrales.</w:t>
+        <w:t>Les familles instrumentales traditionnelles (Bois, Cuivres, Cordes) ne correspondent pas aux regroupements formantiques. L'analyse par zones vocaliques révèle des familles acoustiques transversales qui traversent les frontières organologiques — et qui sont plus pertinentes pour prédire les fusions timbrales. Famille /u/ (200–400 Hz) — Profondeur : Contrebasson (226 Hz), Tuba basse (226), Tuba contrebasse (226), Clarinette basse (323), Contrebasse (172). Trois familles instrumentales, une même couleur sombre et grave. Famille /o/ (400–600 Hz) — Plénitude : Cor anglais (452), Cor (388 Hz, Fp), Trombone (491 Hz, Fp), Violoncelle (495), Basson (495), Saxophone alto (398). C'est le cluster de convergence — la famille acoustique la plus documentée du corpus, réunissant bois, cuivres et cordes. Famille /a/ (800–1 250 Hz) — Puissance : Trombone basse Fp (1 335), Clarinette basse Fp (1 204), Clarinette Sib Fp (1 412), Cor anglais Fp (1 135), Trompette Fp (1 046). Ces instruments partagent une zone de présence et de projection commune dans le médium. Famille /e/ (1 250–2 600 Hz) — Clarté : Flûte Fp (1 535), Hautbois Fp (1 485), Clarinette Mib Fp (1 266), Ensemble de violons F2 (1 163). Instruments de brillance et d'articulation spectrale. Conséquence orchestrale : un compositeur qui veut renforcer la couleur /o/ peut doubler librement entre Cor anglais, Cor, Basson et Violoncelle — la famille acoustique transcende les familles instrumentales. À l'inverse, mélanger deux familles formantiques adjacentes produit la complémentarité spectrale du principe 2.</w:t>
       </w:r>
     </w:p>
     <w:p>
@@ -4278,7 +4429,7 @@
         <w:rPr>
           <w:color w:val="4A148C"/>
         </w:rPr>
-        <w:t>6. Masquage évité</w:t>
+        <w:t>6. Masquage spectral évité</w:t>
       </w:r>
     </w:p>
     <w:p>
@@ -4288,7 +4439,7 @@
           <w:i w:val="0"/>
           <w:sz w:val="20"/>
         </w:rPr>
-        <w:t>Placer deux instruments dans la même zone vocalique sans convergence formantique (Δ = 80–200 Hz) peut créer du masquage spectral — l'un couvre l'autre. La divergence intentionnelle (Δ &gt; 300 Hz) garantit la lisibilité timbrale de chaque voix.</w:t>
+        <w:t>Le masquage spectral — phénomène par lequel un instrument couvre acoustiquement un autre — est particulièrement risqué quand deux instruments partagent une zone vocalique similaire sans convergence formantique (Δ F1 entre 80 et 200 Hz). Dans cette zone grise, les spectres se chevauchent partiellement sans fusionner, créant une concurrence pour la même bande de fréquences. Paires à risque identifiées dans le corpus (Δ 80–200 Hz) : Clarinette Sib (463 Hz) + Alto (377 Hz) : Δ=86 Hz — ni fusion ni complémentarité claire. Basson (495 Hz) + Cor (388 Hz) : Δ=107 Hz — zone de concurrence /o/ ; fonctionne mieux comme convergence intentionnelle (voir principe 1). Cor (388 Hz) + Violon (506 Hz) : Δ=118 Hz — le cor peut couvrir le violon en nuance forte. Trombone basse (258 Hz) + Contrebasse (172 Hz) : Δ=86 Hz — les deux occupent /u/ sans fusionner. Trois stratégies d'évitement : Convergence intentionnelle (Δ ≤ 30 Hz) : pousser les deux instruments vers la fusion complète — le masquage se résout en couleur unique. Divergence intentionnelle (Δ ≥ 300 Hz) : zones spectrales assez éloignées pour coexister — lisibilité timbrale garantie. Différenciation dynamique ou de registre : deux instruments en zone /o/ placés à des dynamiques distinctes (p / f) ou dans des registres éloignés réduisent le chevauchement spectral effectif. Note : le masquage n'est pas toujours à éviter — utilisé intentionnellement, il peut créer un épaississement timbral recherché (tutti à cordes en doublures serrées). C'est un outil d'orchestration, pas seulement un risque.</w:t>
       </w:r>
     </w:p>
     <w:sectPr>

</xml_diff>

<commit_message>
CRITICAL FIX: make_cluster_chart — corriger toutes les valeurs F1
Les valeurs hardcodées dans make_cluster_chart étaient les anciennes
valeurs v33 (Cor=457, Trombone=491, Tuba CB=471, Vcl=499, Basson=502)
qui ne correspondent PAS aux données CSV v22.

Corrections :
- Cor: 457 → 388 Hz
- Trombone: 491 → 237 Hz (retiré, pas dans la zone /o/–/å/)
- Tuba CB: 471 → 226 Hz (retiré, dans zone /u/)
- Violoncelle: 499 → 205 Hz (retiré, dans zone /u/)
- Basson: 502 → 495 Hz

Zone recadrée: 450–502 Hz → 377–510 Hz (/o/–/å/)
Instruments: 6 anciens → 8 corrects (Alto 377, Cor 388, Sax alto 398,
Cor anglais 452, Cl.Sib 463, Basson 495, Ens.Violons 495, Violon 506)
Δmax: 52 Hz → 129 Hz (Alto→Violon)
</commit_message>
<xml_diff>
--- a/Versions-html-and-docx/section_synthese_v4.docx
+++ b/Versions-html-and-docx/section_synthese_v4.docx
@@ -224,7 +224,7 @@
       <w:r>
         <w:drawing>
           <wp:inline xmlns:a="http://schemas.openxmlformats.org/drawingml/2006/main" xmlns:pic="http://schemas.openxmlformats.org/drawingml/2006/picture">
-            <wp:extent cx="5486400" cy="2404153"/>
+            <wp:extent cx="5486400" cy="2438400"/>
             <wp:docPr id="4" name="Picture 4"/>
             <wp:cNvGraphicFramePr>
               <a:graphicFrameLocks noChangeAspect="1"/>
@@ -245,7 +245,7 @@
                   <pic:spPr>
                     <a:xfrm>
                       <a:off x="0" y="0"/>
-                      <a:ext cx="5486400" cy="2404153"/>
+                      <a:ext cx="5486400" cy="2438400"/>
                     </a:xfrm>
                     <a:prstGeom prst="rect"/>
                   </pic:spPr>

</xml_diff>

<commit_message>
Fix: corriger toutes les valeurs v33 dans les tableaux de synthèse
3 endroits corrigés :
1. Tableau DOCX cluster : anciennes 6 lignes (Cor=457, Tuba CB=471,
   Trombone=491, Vcl=499, Basson=502) → 8 lignes correctes CSV v22
   (Alto=377, Cor=388, Sax=398, Cor angl=452, Cl.Sib=463,
   Basson=495, Ens.Violons=495, Violon=506). En-tête: Δ vs Violon.

2. Tableau concordance HTML : Basson=502→495, Cor=457→388,
   Trombone=491→237, Vcl=499→205, Cl.Sib=1016→463.
   Ajout note explicative sur F1 strict vs Fp.

3. Texte Famille /o/ dans principes d'orchestration :
   remplacé Trombone/Vcl (Fp) par les 8 vrais instruments du cluster.
</commit_message>
<xml_diff>
--- a/Versions-html-and-docx/section_synthese_v4.docx
+++ b/Versions-html-and-docx/section_synthese_v4.docx
@@ -366,7 +366,283 @@
                 <w:color w:val="FFFFFF"/>
                 <w:sz w:val="18"/>
               </w:rPr>
-              <w:t>Δ vs Violoncelle</w:t>
+              <w:t>Δ vs Violon</w:t>
+            </w:r>
+          </w:p>
+        </w:tc>
+      </w:tr>
+      <w:tr>
+        <w:tc>
+          <w:tcPr>
+            <w:tcW w:type="dxa" w:w="1701"/>
+          </w:tcPr>
+          <w:p>
+            <w:pPr>
+              <w:jc w:val="center"/>
+            </w:pPr>
+            <w:r/>
+            <w:r>
+              <w:rPr>
+                <w:b/>
+                <w:sz w:val="18"/>
+              </w:rPr>
+              <w:t>Alto</w:t>
+            </w:r>
+          </w:p>
+        </w:tc>
+        <w:tc>
+          <w:tcPr>
+            <w:tcW w:type="dxa" w:w="1134"/>
+          </w:tcPr>
+          <w:p>
+            <w:pPr>
+              <w:jc w:val="center"/>
+            </w:pPr>
+            <w:r/>
+            <w:r>
+              <w:rPr>
+                <w:b w:val="0"/>
+                <w:sz w:val="18"/>
+              </w:rPr>
+              <w:t>Cordes</w:t>
+            </w:r>
+          </w:p>
+        </w:tc>
+        <w:tc>
+          <w:tcPr>
+            <w:tcW w:type="dxa" w:w="850"/>
+          </w:tcPr>
+          <w:p>
+            <w:pPr>
+              <w:jc w:val="center"/>
+            </w:pPr>
+            <w:r/>
+            <w:r>
+              <w:rPr>
+                <w:b w:val="0"/>
+                <w:sz w:val="18"/>
+              </w:rPr>
+              <w:t>377</w:t>
+            </w:r>
+          </w:p>
+        </w:tc>
+        <w:tc>
+          <w:tcPr>
+            <w:tcW w:type="dxa" w:w="850"/>
+          </w:tcPr>
+          <w:p>
+            <w:pPr>
+              <w:jc w:val="center"/>
+            </w:pPr>
+            <w:r/>
+            <w:r>
+              <w:rPr>
+                <w:b w:val="0"/>
+                <w:sz w:val="18"/>
+              </w:rPr>
+              <w:t>/o/</w:t>
+            </w:r>
+          </w:p>
+        </w:tc>
+        <w:tc>
+          <w:tcPr>
+            <w:tcW w:type="dxa" w:w="1134"/>
+          </w:tcPr>
+          <w:p>
+            <w:pPr>
+              <w:jc w:val="center"/>
+            </w:pPr>
+            <w:r/>
+            <w:r>
+              <w:rPr>
+                <w:b w:val="0"/>
+                <w:sz w:val="18"/>
+              </w:rPr>
+              <w:t>129 Hz</w:t>
+            </w:r>
+          </w:p>
+        </w:tc>
+      </w:tr>
+      <w:tr>
+        <w:tc>
+          <w:tcPr>
+            <w:tcW w:type="dxa" w:w="1701"/>
+          </w:tcPr>
+          <w:p>
+            <w:pPr>
+              <w:jc w:val="center"/>
+            </w:pPr>
+            <w:r/>
+            <w:r>
+              <w:rPr>
+                <w:b/>
+                <w:sz w:val="18"/>
+              </w:rPr>
+              <w:t>Cor</w:t>
+            </w:r>
+          </w:p>
+        </w:tc>
+        <w:tc>
+          <w:tcPr>
+            <w:tcW w:type="dxa" w:w="1134"/>
+          </w:tcPr>
+          <w:p>
+            <w:pPr>
+              <w:jc w:val="center"/>
+            </w:pPr>
+            <w:r/>
+            <w:r>
+              <w:rPr>
+                <w:b w:val="0"/>
+                <w:sz w:val="18"/>
+              </w:rPr>
+              <w:t>Cuivres</w:t>
+            </w:r>
+          </w:p>
+        </w:tc>
+        <w:tc>
+          <w:tcPr>
+            <w:tcW w:type="dxa" w:w="850"/>
+          </w:tcPr>
+          <w:p>
+            <w:pPr>
+              <w:jc w:val="center"/>
+            </w:pPr>
+            <w:r/>
+            <w:r>
+              <w:rPr>
+                <w:b w:val="0"/>
+                <w:sz w:val="18"/>
+              </w:rPr>
+              <w:t>388</w:t>
+            </w:r>
+          </w:p>
+        </w:tc>
+        <w:tc>
+          <w:tcPr>
+            <w:tcW w:type="dxa" w:w="850"/>
+          </w:tcPr>
+          <w:p>
+            <w:pPr>
+              <w:jc w:val="center"/>
+            </w:pPr>
+            <w:r/>
+            <w:r>
+              <w:rPr>
+                <w:b w:val="0"/>
+                <w:sz w:val="18"/>
+              </w:rPr>
+              <w:t>/o/</w:t>
+            </w:r>
+          </w:p>
+        </w:tc>
+        <w:tc>
+          <w:tcPr>
+            <w:tcW w:type="dxa" w:w="1134"/>
+          </w:tcPr>
+          <w:p>
+            <w:pPr>
+              <w:jc w:val="center"/>
+            </w:pPr>
+            <w:r/>
+            <w:r>
+              <w:rPr>
+                <w:b w:val="0"/>
+                <w:sz w:val="18"/>
+              </w:rPr>
+              <w:t>118 Hz</w:t>
+            </w:r>
+          </w:p>
+        </w:tc>
+      </w:tr>
+      <w:tr>
+        <w:tc>
+          <w:tcPr>
+            <w:tcW w:type="dxa" w:w="1701"/>
+          </w:tcPr>
+          <w:p>
+            <w:pPr>
+              <w:jc w:val="center"/>
+            </w:pPr>
+            <w:r/>
+            <w:r>
+              <w:rPr>
+                <w:b/>
+                <w:sz w:val="18"/>
+              </w:rPr>
+              <w:t>Sax alto</w:t>
+            </w:r>
+          </w:p>
+        </w:tc>
+        <w:tc>
+          <w:tcPr>
+            <w:tcW w:type="dxa" w:w="1134"/>
+          </w:tcPr>
+          <w:p>
+            <w:pPr>
+              <w:jc w:val="center"/>
+            </w:pPr>
+            <w:r/>
+            <w:r>
+              <w:rPr>
+                <w:b w:val="0"/>
+                <w:sz w:val="18"/>
+              </w:rPr>
+              <w:t>Saxophones</w:t>
+            </w:r>
+          </w:p>
+        </w:tc>
+        <w:tc>
+          <w:tcPr>
+            <w:tcW w:type="dxa" w:w="850"/>
+          </w:tcPr>
+          <w:p>
+            <w:pPr>
+              <w:jc w:val="center"/>
+            </w:pPr>
+            <w:r/>
+            <w:r>
+              <w:rPr>
+                <w:b w:val="0"/>
+                <w:sz w:val="18"/>
+              </w:rPr>
+              <w:t>398</w:t>
+            </w:r>
+          </w:p>
+        </w:tc>
+        <w:tc>
+          <w:tcPr>
+            <w:tcW w:type="dxa" w:w="850"/>
+          </w:tcPr>
+          <w:p>
+            <w:pPr>
+              <w:jc w:val="center"/>
+            </w:pPr>
+            <w:r/>
+            <w:r>
+              <w:rPr>
+                <w:b w:val="0"/>
+                <w:sz w:val="18"/>
+              </w:rPr>
+              <w:t>/o/</w:t>
+            </w:r>
+          </w:p>
+        </w:tc>
+        <w:tc>
+          <w:tcPr>
+            <w:tcW w:type="dxa" w:w="1134"/>
+          </w:tcPr>
+          <w:p>
+            <w:pPr>
+              <w:jc w:val="center"/>
+            </w:pPr>
+            <w:r/>
+            <w:r>
+              <w:rPr>
+                <w:b w:val="0"/>
+                <w:sz w:val="18"/>
+              </w:rPr>
+              <w:t>108 Hz</w:t>
             </w:r>
           </w:p>
         </w:tc>
@@ -458,7 +734,7 @@
                 <w:b w:val="0"/>
                 <w:sz w:val="18"/>
               </w:rPr>
-              <w:t>47 Hz</w:t>
+              <w:t>54 Hz</w:t>
             </w:r>
           </w:p>
         </w:tc>
@@ -478,7 +754,7 @@
                 <w:b/>
                 <w:sz w:val="18"/>
               </w:rPr>
-              <w:t>Cor</w:t>
+              <w:t>Cl. Sib</w:t>
             </w:r>
           </w:p>
         </w:tc>
@@ -496,7 +772,7 @@
                 <w:b w:val="0"/>
                 <w:sz w:val="18"/>
               </w:rPr>
-              <w:t>Cuivres</w:t>
+              <w:t>Bois</w:t>
             </w:r>
           </w:p>
         </w:tc>
@@ -514,7 +790,7 @@
                 <w:b w:val="0"/>
                 <w:sz w:val="18"/>
               </w:rPr>
-              <w:t>457</w:t>
+              <w:t>463</w:t>
             </w:r>
           </w:p>
         </w:tc>
@@ -550,7 +826,7 @@
                 <w:b w:val="0"/>
                 <w:sz w:val="18"/>
               </w:rPr>
-              <w:t>42 Hz</w:t>
+              <w:t>43 Hz</w:t>
             </w:r>
           </w:p>
         </w:tc>
@@ -570,7 +846,7 @@
                 <w:b/>
                 <w:sz w:val="18"/>
               </w:rPr>
-              <w:t>Tuba contrebasse</w:t>
+              <w:t>Basson</w:t>
             </w:r>
           </w:p>
         </w:tc>
@@ -588,7 +864,7 @@
                 <w:b w:val="0"/>
                 <w:sz w:val="18"/>
               </w:rPr>
-              <w:t>Cuivres</w:t>
+              <w:t>Bois</w:t>
             </w:r>
           </w:p>
         </w:tc>
@@ -606,7 +882,7 @@
                 <w:b w:val="0"/>
                 <w:sz w:val="18"/>
               </w:rPr>
-              <w:t>471</w:t>
+              <w:t>495</w:t>
             </w:r>
           </w:p>
         </w:tc>
@@ -642,7 +918,7 @@
                 <w:b w:val="0"/>
                 <w:sz w:val="18"/>
               </w:rPr>
-              <w:t>28 Hz</w:t>
+              <w:t>11 Hz ★</w:t>
             </w:r>
           </w:p>
         </w:tc>
@@ -662,7 +938,7 @@
                 <w:b/>
                 <w:sz w:val="18"/>
               </w:rPr>
-              <w:t>Trombone</w:t>
+              <w:t>Ens. Violons</w:t>
             </w:r>
           </w:p>
         </w:tc>
@@ -680,7 +956,7 @@
                 <w:b w:val="0"/>
                 <w:sz w:val="18"/>
               </w:rPr>
-              <w:t>Cuivres</w:t>
+              <w:t>Cordes</w:t>
             </w:r>
           </w:p>
         </w:tc>
@@ -698,7 +974,7 @@
                 <w:b w:val="0"/>
                 <w:sz w:val="18"/>
               </w:rPr>
-              <w:t>491</w:t>
+              <w:t>495</w:t>
             </w:r>
           </w:p>
         </w:tc>
@@ -734,7 +1010,7 @@
                 <w:b w:val="0"/>
                 <w:sz w:val="18"/>
               </w:rPr>
-              <w:t>8 Hz</w:t>
+              <w:t>11 Hz ★</w:t>
             </w:r>
           </w:p>
         </w:tc>
@@ -743,7 +1019,6 @@
         <w:tc>
           <w:tcPr>
             <w:tcW w:type="dxa" w:w="1701"/>
-            <w:shd w:fill="D5F5E3"/>
           </w:tcPr>
           <w:p>
             <w:pPr>
@@ -755,14 +1030,13 @@
                 <w:b/>
                 <w:sz w:val="18"/>
               </w:rPr>
-              <w:t>Violoncelle</w:t>
+              <w:t>Violon</w:t>
             </w:r>
           </w:p>
         </w:tc>
         <w:tc>
           <w:tcPr>
             <w:tcW w:type="dxa" w:w="1134"/>
-            <w:shd w:fill="D5F5E3"/>
           </w:tcPr>
           <w:p>
             <w:pPr>
@@ -781,7 +1055,6 @@
         <w:tc>
           <w:tcPr>
             <w:tcW w:type="dxa" w:w="850"/>
-            <w:shd w:fill="D5F5E3"/>
           </w:tcPr>
           <w:p>
             <w:pPr>
@@ -793,14 +1066,13 @@
                 <w:b w:val="0"/>
                 <w:sz w:val="18"/>
               </w:rPr>
-              <w:t>499</w:t>
+              <w:t>506</w:t>
             </w:r>
           </w:p>
         </w:tc>
         <w:tc>
           <w:tcPr>
             <w:tcW w:type="dxa" w:w="850"/>
-            <w:shd w:fill="D5F5E3"/>
           </w:tcPr>
           <w:p>
             <w:pPr>
@@ -819,7 +1091,6 @@
         <w:tc>
           <w:tcPr>
             <w:tcW w:type="dxa" w:w="1134"/>
-            <w:shd w:fill="D5F5E3"/>
           </w:tcPr>
           <w:p>
             <w:pPr>
@@ -831,104 +1102,7 @@
                 <w:b w:val="0"/>
                 <w:sz w:val="18"/>
               </w:rPr>
-              <w:t>—</w:t>
-            </w:r>
-          </w:p>
-        </w:tc>
-      </w:tr>
-      <w:tr>
-        <w:tc>
-          <w:tcPr>
-            <w:tcW w:type="dxa" w:w="1701"/>
-            <w:shd w:fill="D5F5E3"/>
-          </w:tcPr>
-          <w:p>
-            <w:pPr>
-              <w:jc w:val="center"/>
-            </w:pPr>
-            <w:r/>
-            <w:r>
-              <w:rPr>
-                <w:b/>
-                <w:sz w:val="18"/>
-              </w:rPr>
-              <w:t>Basson</w:t>
-            </w:r>
-          </w:p>
-        </w:tc>
-        <w:tc>
-          <w:tcPr>
-            <w:tcW w:type="dxa" w:w="1134"/>
-            <w:shd w:fill="D5F5E3"/>
-          </w:tcPr>
-          <w:p>
-            <w:pPr>
-              <w:jc w:val="center"/>
-            </w:pPr>
-            <w:r/>
-            <w:r>
-              <w:rPr>
-                <w:b w:val="0"/>
-                <w:sz w:val="18"/>
-              </w:rPr>
-              <w:t>Bois</w:t>
-            </w:r>
-          </w:p>
-        </w:tc>
-        <w:tc>
-          <w:tcPr>
-            <w:tcW w:type="dxa" w:w="850"/>
-            <w:shd w:fill="D5F5E3"/>
-          </w:tcPr>
-          <w:p>
-            <w:pPr>
-              <w:jc w:val="center"/>
-            </w:pPr>
-            <w:r/>
-            <w:r>
-              <w:rPr>
-                <w:b w:val="0"/>
-                <w:sz w:val="18"/>
-              </w:rPr>
-              <w:t>502</w:t>
-            </w:r>
-          </w:p>
-        </w:tc>
-        <w:tc>
-          <w:tcPr>
-            <w:tcW w:type="dxa" w:w="850"/>
-            <w:shd w:fill="D5F5E3"/>
-          </w:tcPr>
-          <w:p>
-            <w:pPr>
-              <w:jc w:val="center"/>
-            </w:pPr>
-            <w:r/>
-            <w:r>
-              <w:rPr>
-                <w:b w:val="0"/>
-                <w:sz w:val="18"/>
-              </w:rPr>
-              <w:t>/o/</w:t>
-            </w:r>
-          </w:p>
-        </w:tc>
-        <w:tc>
-          <w:tcPr>
-            <w:tcW w:type="dxa" w:w="1134"/>
-            <w:shd w:fill="D5F5E3"/>
-          </w:tcPr>
-          <w:p>
-            <w:pPr>
-              <w:jc w:val="center"/>
-            </w:pPr>
-            <w:r/>
-            <w:r>
-              <w:rPr>
-                <w:b w:val="0"/>
-                <w:sz w:val="18"/>
-              </w:rPr>
-              <w:t>3 Hz ★</w:t>
+              <w:t>— (réf.)</w:t>
             </w:r>
           </w:p>
         </w:tc>
@@ -4418,7 +4592,7 @@
           <w:i w:val="0"/>
           <w:sz w:val="20"/>
         </w:rPr>
-        <w:t>Les familles instrumentales traditionnelles (Bois, Cuivres, Cordes) ne correspondent pas aux regroupements formantiques. L'analyse par zones vocaliques révèle des familles acoustiques transversales qui traversent les frontières organologiques — et qui sont plus pertinentes pour prédire les fusions timbrales. Famille /u/ (200–400 Hz) — Profondeur : Contrebasson (226 Hz), Tuba basse (226), Tuba contrebasse (226), Clarinette basse (323), Contrebasse (172). Trois familles instrumentales, une même couleur sombre et grave. Famille /o/ (400–600 Hz) — Plénitude : Cor anglais (452), Cor (388 Hz, Fp), Trombone (491 Hz, Fp), Violoncelle (495), Basson (495), Saxophone alto (398). C'est le cluster de convergence — la famille acoustique la plus documentée du corpus, réunissant bois, cuivres et cordes. Famille /a/ (800–1 250 Hz) — Puissance : Trombone basse Fp (1 335), Clarinette basse Fp (1 204), Clarinette Sib Fp (1 412), Cor anglais Fp (1 135), Trompette Fp (1 046). Ces instruments partagent une zone de présence et de projection commune dans le médium. Famille /e/ (1 250–2 600 Hz) — Clarté : Flûte Fp (1 535), Hautbois Fp (1 485), Clarinette Mib Fp (1 266), Ensemble de violons F2 (1 163). Instruments de brillance et d'articulation spectrale. Conséquence orchestrale : un compositeur qui veut renforcer la couleur /o/ peut doubler librement entre Cor anglais, Cor, Basson et Violoncelle — la famille acoustique transcende les familles instrumentales. À l'inverse, mélanger deux familles formantiques adjacentes produit la complémentarité spectrale du principe 2.</w:t>
+        <w:t>Les familles instrumentales traditionnelles (Bois, Cuivres, Cordes) ne correspondent pas aux regroupements formantiques. L'analyse par zones vocaliques révèle des familles acoustiques transversales qui traversent les frontières organologiques — et qui sont plus pertinentes pour prédire les fusions timbrales. Famille /u/ (200–400 Hz) — Profondeur : Contrebasson (226 Hz), Tuba basse (226), Tuba contrebasse (226), Clarinette basse (323), Contrebasse (172). Trois familles instrumentales, une même couleur sombre et grave. Famille /o/–/å/ (377–510 Hz) — Plénitude : Alto (377), Cor (388), Sax alto (398), Cor anglais (452), Cl. Sib (463), Basson (495), Ens. Violons (495), Violon (506). C'est le cluster de convergence — 8 instruments de 4 familles réunis dans 129 Hz. Note : Trombone (F1=237 Hz, /u/) et Violoncelle (F1=205 Hz, /u/) rejoignent cette zone via leur Fp centroïde (1 218 Hz et ~600 Hz). Famille /a/ (800–1 250 Hz) — Puissance : Trombone basse Fp (1 335), Clarinette basse Fp (1 204), Clarinette Sib Fp (1 412), Cor anglais Fp (1 135), Trompette Fp (1 046). Ces instruments partagent une zone de présence et de projection commune dans le médium. Famille /e/ (1 250–2 600 Hz) — Clarté : Flûte Fp (1 535), Hautbois Fp (1 485), Clarinette Mib Fp (1 266), Ensemble de violons F2 (1 163). Instruments de brillance et d'articulation spectrale. Conséquence orchestrale : un compositeur qui veut renforcer la couleur /o/ peut doubler librement entre Cor anglais, Cor, Basson et Violon — la famille acoustique transcende les familles instrumentales. À l'inverse, mélanger deux familles formantiques adjacentes produit la complémentarité spectrale du principe 2.</w:t>
       </w:r>
     </w:p>
     <w:p>

</xml_diff>